<commit_message>
Split Pancasila Canva slides strictly into Kelas 4 and Kelas 5 decks with alternating textbook and everyday life storytelling rhythm
</commit_message>
<xml_diff>
--- a/docs/Pancasila_Konten_Canva_dan_MiniTest_C3_C4_Bab3.docx
+++ b/docs/Pancasila_Konten_Canva_dan_MiniTest_C3_C4_Bab3.docx
@@ -34,7 +34,7 @@
                 <w:color w:val="FDE047"/>
                 <w:sz w:val="20"/>
               </w:rPr>
-              <w:t>⭐ KHUSUS PENDIDIKAN PANCASILA ⭐</w:t>
+              <w:t>⭐ SLIDE PRESENTATION DECK &amp; EVALUASI MANDIRI ⭐</w:t>
               <w:br/>
             </w:r>
             <w:r>
@@ -44,7 +44,7 @@
                 <w:color w:val="FFFFFF"/>
                 <w:sz w:val="33"/>
               </w:rPr>
-              <w:t>SLIDE CANVA &amp; MINI TEST C3-C4: PENDIDIKAN PANCASILA BAB 3</w:t>
+              <w:t>RANCANGAN SLIDE CANVA &amp; MINI TEST C3-C4 PENDIDIKAN PANCASILA</w:t>
               <w:br/>
             </w:r>
             <w:r>
@@ -54,7 +54,9 @@
                 <w:color w:val="F1F5F9"/>
                 <w:sz w:val="20"/>
               </w:rPr>
-              <w:t>Storyboard Presentasi 16:9 &amp; Bank Evaluasi Studi Kasus Nyata</w:t>
+              <w:t>Terpisah Khusus Kelas 4 dan Kelas 5 (Bukan Multigrade)</w:t>
+              <w:br/>
+              <w:t>Pola Bergantian: Konsep Textbook Kemendikbud &amp; Cerita Keseharian Nyata</w:t>
               <w:br/>
               <w:t>PKBM Penerus Bangsa • Pendekatan Storytelling Pak Gita Wirjawan</w:t>
             </w:r>
@@ -65,13 +67,37 @@
     <w:p/>
     <w:p>
       <w:pPr>
+        <w:spacing w:line="276" w:lineRule="auto"/>
+      </w:pPr>
+      <w:r>
+        <w:rPr>
+          <w:b/>
+        </w:rPr>
+        <w:t>💡 Struktur Pola Presentasi Canva (Pola Bergantian Guru Tiara):</w:t>
+        <w:br/>
+      </w:r>
+      <w:r>
+        <w:rPr>
+          <w:i/>
+        </w:rPr>
+        <w:t>Setiap deck presentasi dirancang khusus untuk sesi belajar 60 menit per kelas, berirama selang-seling secara harmonis:</w:t>
+        <w:br/>
+        <w:t>• Slide Ganjil: Konsep Kunci Buku Siswa Kemendikbud (Materi resmi, definisi, fakta kebangsaan, dan teori ilmiah).</w:t>
+        <w:br/>
+        <w:t>• Slide Genap: Penerapan dalam Kehidupan Sehari-hari (Storytelling kehidupan Aqlan &amp; Mishka, hobi skateboard &amp; senam lantai, studi kasus lingkungan, dan aksi nyata).</w:t>
+        <w:br/>
+      </w:r>
+    </w:p>
+    <w:p/>
+    <w:p>
+      <w:pPr>
         <w:pStyle w:val="Heading1"/>
       </w:pPr>
       <w:r>
         <w:rPr>
           <w:color w:val="BE123C"/>
         </w:rPr>
-        <w:t>BAGIAN I: 10 SLIDE STORYBOARD CANVA (16:9 WIDESCREEN)</w:t>
+        <w:t>DECK 1: KELAS 4 PENDIDIKAN PANCASILA (AQLAN, HASYIF, KINANTI, ALISYA)</w:t>
       </w:r>
     </w:p>
     <w:tbl>
@@ -106,7 +132,17 @@
                 <w:color w:val="BE123C"/>
                 <w:sz w:val="22"/>
               </w:rPr>
-              <w:t>SLIDE 1: COVER UTAMA: KSATRIA BHINNEKA &amp; PELINDUNG NEGERI</w:t>
+              <w:t>SLIDE 1: COVER: MISI KSATRIA GOTONG ROYONG CILIK</w:t>
+              <w:br/>
+            </w:r>
+            <w:r>
+              <w:rPr>
+                <w:rFonts w:ascii="Calibri" w:hAnsi="Calibri"/>
+                <w:b/>
+                <w:color w:val="4338CA"/>
+                <w:sz w:val="19"/>
+              </w:rPr>
+              <w:t>[📚 KONSEP TEXTBOOK KEMENDIKBUD]</w:t>
               <w:br/>
             </w:r>
             <w:r>
@@ -116,7 +152,7 @@
                 <w:color w:val="64748B"/>
                 <w:sz w:val="19"/>
               </w:rPr>
-              <w:t>🎨 Visual Cue Canva: Background merah marun dan krem hangat, siluet anak bermain skateboard, penari senam lantai, dan bendera merah putih berkibar.</w:t>
+              <w:t>🎨 Visual Cue Canva: 16:9 Widescreen, palet warna merah marun (#BE123C) dipadu krem hangat dan hijau toska lembut. Ilustrasi Aqlan memakai helm skater memegang papan, dikelilingi teman-teman membawa cangkul dan bendera merah putih.</w:t>
               <w:br/>
             </w:r>
             <w:r>
@@ -126,7 +162,7 @@
                 <w:color w:val="1E293B"/>
                 <w:sz w:val="19"/>
               </w:rPr>
-              <w:t>📖 Story Hook: "Bayangkan dirimu menjadi pahlawan dalam cerita hidupmu sendiri. Apa yang kamu lakukan saat teman butuh bantuan atau saat kamu berbuat kesalahan?"</w:t>
+              <w:t>🎙️ Narasi/Pancingan Guru: "Halo Aqlan dan kawan-kawan! Hari ini kita akan membuktikan bahwa anak-anak seusia kalian bisa menjadi pahlawan penyelamat lingkungan lewat kekuatan kerja sama!"</w:t>
               <w:br/>
               <w:br/>
             </w:r>
@@ -136,7 +172,7 @@
                 <w:color w:val="334155"/>
                 <w:sz w:val="19"/>
               </w:rPr>
-              <w:t xml:space="preserve">  • Judul: PETUALANGAN KSATRIA PANCASILA: MENEMUKAN HIKMAH KISAH NYATA</w:t>
+              <w:t xml:space="preserve">  • Judul Slide: MISI KSATRIA GOTONG ROYONG &amp; PERSATUAN DI SEKITARKU</w:t>
               <w:br/>
             </w:r>
             <w:r>
@@ -145,7 +181,7 @@
                 <w:color w:val="334155"/>
                 <w:sz w:val="19"/>
               </w:rPr>
-              <w:t xml:space="preserve">  • Sub-Judul: Bab 3 Pendidikan Pancasila Multigrade (Kelas 4, 5, 6)</w:t>
+              <w:t xml:space="preserve">  • Mata Pelajaran: Pendidikan Pancasila Bab 3 (Kelas 4 SD/Fase B)</w:t>
               <w:br/>
             </w:r>
             <w:r>
@@ -154,7 +190,16 @@
                 <w:color w:val="334155"/>
                 <w:sz w:val="19"/>
               </w:rPr>
-              <w:t xml:space="preserve">  • Gagasan Gita Wirjawan: 'Pancasila bukan hafalan teks dingin, melainkan tindakan nyata saat kita menghadapi masalah di perumahan dan sekolah!'</w:t>
+              <w:t xml:space="preserve">  • Tokoh Cerita: Aqlan, Hasyif, Kinanti, Samuel, dan Alisya</w:t>
+              <w:br/>
+            </w:r>
+            <w:r>
+              <w:rPr>
+                <w:rFonts w:ascii="Calibri" w:hAnsi="Calibri"/>
+                <w:color w:val="334155"/>
+                <w:sz w:val="19"/>
+              </w:rPr>
+              <w:t xml:space="preserve">  • Fokus Nilai: Gotong Royong, Persatuan Sila ke-3, dan Bahasa Indonesia Pemersatu</w:t>
               <w:br/>
             </w:r>
             <w:r>
@@ -203,7 +248,17 @@
                 <w:color w:val="BE123C"/>
                 <w:sz w:val="22"/>
               </w:rPr>
-              <w:t>SLIDE 2: APERSEPSI: RAHASIA SAPU LIDI &amp; PERSATUAN BANGSA</w:t>
+              <w:t>SLIDE 2: TEXTBOOK: APA ITU KEBERAGAMAN SOSIAL BUDAYA?</w:t>
+              <w:br/>
+            </w:r>
+            <w:r>
+              <w:rPr>
+                <w:rFonts w:ascii="Calibri" w:hAnsi="Calibri"/>
+                <w:b/>
+                <w:color w:val="4338CA"/>
+                <w:sz w:val="19"/>
+              </w:rPr>
+              <w:t>[📚 KONSEP TEXTBOOK KEMENDIKBUD]</w:t>
               <w:br/>
             </w:r>
             <w:r>
@@ -213,7 +268,7 @@
                 <w:color w:val="64748B"/>
                 <w:sz w:val="19"/>
               </w:rPr>
-              <w:t>🎨 Visual Cue Canva: Sebatang lidi rapuh patah terbelah dua (kiri) vs seikat sapu lidi kokoh menyapu tumpukan batu dan sampah bersih seketika (kanan).</w:t>
+              <w:t>🎨 Visual Cue Canva: Infografis peta Indonesia dengan 4 ikon pilar keragaman: rumah adat, pakaian daerah, alat musik, dan rumah ibadah. Layout clean dengan teks tebal mudah dibaca.</w:t>
               <w:br/>
             </w:r>
             <w:r>
@@ -223,7 +278,7 @@
                 <w:color w:val="1E293B"/>
                 <w:sz w:val="19"/>
               </w:rPr>
-              <w:t>📖 Story Hook: "Sebatang lidi mengeluh capek membersihkan lapangan sendirian. Mengapa ketika kawan-kawannya bersatu, beban itu langsung lenyap?"</w:t>
+              <w:t>🎙️ Narasi/Pancingan Guru: "Coba lihat sekeliling rumah dan sekolah kita. Mengapa teman-teman kita punya asal daerah, makanan kesukaan, dan tradisi keluarga yang berbeda-beda?"</w:t>
               <w:br/>
               <w:br/>
             </w:r>
@@ -233,7 +288,7 @@
                 <w:color w:val="334155"/>
                 <w:sz w:val="19"/>
               </w:rPr>
-              <w:t xml:space="preserve">  • Satu Batang Lidi: Sendirian kita lemah dan mudah patah saat menghadapi tantangan.</w:t>
+              <w:t xml:space="preserve">  • Buku Siswa Kemendikbud Hal 63-70: Indonesia adalah negara kepulauan yang memiliki lebih dari 1.340 suku bangsa dan 718 bahasa daerah.</w:t>
               <w:br/>
             </w:r>
             <w:r>
@@ -242,7 +297,7 @@
                 <w:color w:val="334155"/>
                 <w:sz w:val="19"/>
               </w:rPr>
-              <w:t xml:space="preserve">  • Seikat Sapu Lidi: Ratusan lidi berbeda ukuran saat diikat kuat mampu membersihkan halaman seluas apa pun!</w:t>
+              <w:t xml:space="preserve">  • Bentuk Keberagaman di Lingkungan Kita: 1) Keragaman Suku Bangsa, 2) Bahasa Daerah, 3) Tradisi &amp; Adat Istiadat, 4) Agama &amp; Keyakinan.</w:t>
               <w:br/>
             </w:r>
             <w:r>
@@ -251,7 +306,123 @@
                 <w:color w:val="334155"/>
                 <w:sz w:val="19"/>
               </w:rPr>
-              <w:t xml:space="preserve">  • Intisari Pancasila: 'Gotong royong adalah DNA ketahanan bangsa kita: Bersatu kita teguh, bercerai kita runtuh!'</w:t>
+              <w:t xml:space="preserve">  • Prinsip Kebinekaan: Perbedaan bukan alasan untuk saling memusuhi, melainkan anugerah Tuhan Yang Maha Esa yang memperkaya kebudayaan nasional.</w:t>
+              <w:br/>
+            </w:r>
+            <w:r>
+              <w:rPr>
+                <w:rFonts w:ascii="Calibri" w:hAnsi="Calibri"/>
+                <w:color w:val="334155"/>
+                <w:sz w:val="19"/>
+              </w:rPr>
+              <w:t xml:space="preserve">  • Tugas Pelajar: Menghormati perbedaan dengan semboyan 'Bhinneka Tunggal Ika' (Berbeda-beda tetapi tetap satu jua).</w:t>
+              <w:br/>
+            </w:r>
+          </w:p>
+        </w:tc>
+      </w:tr>
+    </w:tbl>
+    <w:p/>
+    <w:tbl>
+      <w:tblPr>
+        <w:tblW w:type="auto" w:w="0"/>
+        <w:jc w:val="center"/>
+        <w:tblLook w:firstColumn="1" w:firstRow="1" w:lastColumn="0" w:lastRow="0" w:noHBand="0" w:noVBand="1" w:val="04A0"/>
+      </w:tblPr>
+      <w:tblGrid>
+        <w:gridCol w:w="9792"/>
+      </w:tblGrid>
+      <w:tr>
+        <w:tc>
+          <w:tcPr>
+            <w:tcW w:type="dxa" w:w="9792"/>
+            <w:shd w:val="clear" w:color="auto" w:fill="FFF1F2"/>
+            <w:tcMar>
+              <w:top w:w="180" w:type="dxa"/>
+              <w:bottom w:w="180" w:type="dxa"/>
+              <w:left w:w="200" w:type="dxa"/>
+              <w:right w:w="200" w:type="dxa"/>
+            </w:tcMar>
+          </w:tcPr>
+          <w:p>
+            <w:pPr>
+              <w:spacing w:line="276" w:lineRule="auto"/>
+            </w:pPr>
+            <w:r>
+              <w:rPr>
+                <w:rFonts w:ascii="Calibri" w:hAnsi="Calibri"/>
+                <w:b/>
+                <w:color w:val="BE123C"/>
+                <w:sz w:val="22"/>
+              </w:rPr>
+              <w:t>SLIDE 3: KESEHARIAN: TETANGGA BARU DARI BERBAGAI PULAU DI SKATEPARK</w:t>
+              <w:br/>
+            </w:r>
+            <w:r>
+              <w:rPr>
+                <w:rFonts w:ascii="Calibri" w:hAnsi="Calibri"/>
+                <w:b/>
+                <w:color w:val="B45309"/>
+                <w:sz w:val="19"/>
+              </w:rPr>
+              <w:t>[🏡 KONTEKS NYATA SEHARI-HARI]</w:t>
+              <w:br/>
+            </w:r>
+            <w:r>
+              <w:rPr>
+                <w:rFonts w:ascii="Calibri" w:hAnsi="Calibri"/>
+                <w:i/>
+                <w:color w:val="64748B"/>
+                <w:sz w:val="19"/>
+              </w:rPr>
+              <w:t>🎨 Visual Cue Canva: Ilustrasi Aqlan meluncur di arena skatepark komplek perumahan, di sampingnya ada Samuel (anak baru asal Maluku) dan Hasyif yang sedang duduk di bangku taman.</w:t>
+              <w:br/>
+            </w:r>
+            <w:r>
+              <w:rPr>
+                <w:rFonts w:ascii="Calibri" w:hAnsi="Calibri"/>
+                <w:b/>
+                <w:color w:val="1E293B"/>
+                <w:sz w:val="19"/>
+              </w:rPr>
+              <w:t>🎙️ Narasi/Pancingan Guru: "Aqlan, bayangkan jika kamu baru pindah ke pulau yang jauh dan belum punya teman. Apa yang paling membuat hatimu senang saat pertama kali datang ke lapangan bermain?"</w:t>
+              <w:br/>
+              <w:br/>
+            </w:r>
+            <w:r>
+              <w:rPr>
+                <w:rFonts w:ascii="Calibri" w:hAnsi="Calibri"/>
+                <w:color w:val="334155"/>
+                <w:sz w:val="19"/>
+              </w:rPr>
+              <w:t xml:space="preserve">  • Kisah Nyata Aqlan di Komplek: Di perumahan tempat tinggal Aqlan, warga berasal dari berbagai suku: Jawa, Sunda, Batak, Minang, hingga Maluku.</w:t>
+              <w:br/>
+            </w:r>
+            <w:r>
+              <w:rPr>
+                <w:rFonts w:ascii="Calibri" w:hAnsi="Calibri"/>
+                <w:color w:val="334155"/>
+                <w:sz w:val="19"/>
+              </w:rPr>
+              <w:t xml:space="preserve">  • Pertemuan di Lapangan Bermain: Aqlan bertemu Samuel, anak baru pindahan dari Ambon yang belum lancar berbahasa daerah setempat dan pemalu.</w:t>
+              <w:br/>
+            </w:r>
+            <w:r>
+              <w:rPr>
+                <w:rFonts w:ascii="Calibri" w:hAnsi="Calibri"/>
+                <w:color w:val="334155"/>
+                <w:sz w:val="19"/>
+              </w:rPr>
+              <w:t xml:space="preserve">  • Pilihan Aqlan: Apakah Aqlan menjauh karena merasa Samuel 'berbeda', ataukah Aqlan menyapa dan mengajaknya bermain skateboard bersama?</w:t>
+              <w:br/>
+            </w:r>
+            <w:r>
+              <w:rPr>
+                <w:rFonts w:ascii="Calibri" w:hAnsi="Calibri"/>
+                <w:color w:val="334155"/>
+                <w:sz w:val="19"/>
+              </w:rPr>
+              <w:t xml:space="preserve">  • Nilai Tindakan: Membuka diri dan menyapa teman baru adalah langkah pertama merawat keberagaman sosial di lingkungan bermain kita!</w:t>
               <w:br/>
             </w:r>
           </w:p>
@@ -291,7 +462,17 @@
                 <w:color w:val="BE123C"/>
                 <w:sz w:val="22"/>
               </w:rPr>
-              <w:t>SLIDE 3: KELAS 4: MISI BADAI BERINGIN &amp; JALUR SKATEBOARD</w:t>
+              <w:t>SLIDE 4: TEXTBOOK: TRADISI GOTONG ROYONG CIRI KHAS BANGSA</w:t>
+              <w:br/>
+            </w:r>
+            <w:r>
+              <w:rPr>
+                <w:rFonts w:ascii="Calibri" w:hAnsi="Calibri"/>
+                <w:b/>
+                <w:color w:val="4338CA"/>
+                <w:sz w:val="19"/>
+              </w:rPr>
+              <w:t>[📚 KONSEP TEXTBOOK KEMENDIKBUD]</w:t>
               <w:br/>
             </w:r>
             <w:r>
@@ -301,7 +482,7 @@
                 <w:color w:val="64748B"/>
                 <w:sz w:val="19"/>
               </w:rPr>
-              <w:t>🎨 Visual Cue Canva: Aqlan memakai helm skateboard membawa cangkul bersama warga desa membersihkan dahan beringin tumbang.</w:t>
+              <w:t>🎨 Visual Cue Canva: Kolase foto/vektor 3 tradisi gotong royong nusantara: Gugur Gunung (Jawa), Mapalus (Minahasa), dan Rambu Solo/Sikaroban.</w:t>
               <w:br/>
             </w:r>
             <w:r>
@@ -311,7 +492,7 @@
                 <w:color w:val="1E293B"/>
                 <w:sz w:val="19"/>
               </w:rPr>
-              <w:t>📖 Story Hook: "Aqlan bisa saja pergi mencari jalan lain. Tapi mengapa memilih kerja bakti bersama warga justru membuka persahabatan yang seru?"</w:t>
+              <w:t>🎙️ Narasi/Pancingan Guru: "Nenek moyang kita sejak dulu tidak pernah membangun jembatan atau memanen padi sendirian. Mereka selalu mengerjakannya bersama-sama. Tahukah kamu apa sebutannya di berbagai daerah?"</w:t>
               <w:br/>
               <w:br/>
             </w:r>
@@ -321,7 +502,7 @@
                 <w:color w:val="334155"/>
                 <w:sz w:val="19"/>
               </w:rPr>
-              <w:t xml:space="preserve">  • Studi Kasus Aqlan: Pohon tumbang menutup jalan latihan dan menyumbat saluran air menjelang hujan lebat.</w:t>
+              <w:t xml:space="preserve">  • Buku Siswa Kemendikbud Hal 71-82: Gotong royong adalah tradisi luhur bangsa Indonesia yang telah hidup sejak zaman nenek moyang.</w:t>
               <w:br/>
             </w:r>
             <w:r>
@@ -330,7 +511,7 @@
                 <w:color w:val="334155"/>
                 <w:sz w:val="19"/>
               </w:rPr>
-              <w:t xml:space="preserve">  • Dilema Ksatria: Pulang tidur atau turun tangan bersama Pak RT dan tetangga baru asal Maluku?</w:t>
+              <w:t xml:space="preserve">  • Definisi Resmi: Gotong royong adalah bekerja bersama-sama secara sukarela tanpa pamrih/upah demi mencapai tujuan kepentingan umum.</w:t>
               <w:br/>
             </w:r>
             <w:r>
@@ -339,7 +520,123 @@
                 <w:color w:val="334155"/>
                 <w:sz w:val="19"/>
               </w:rPr>
-              <w:t xml:space="preserve">  • 4 Keajaiban Gotong Royong: 1) Kerja 5 hari selesai 45 menit, 2) Lingkungan bebas banjir, 3) Hemat biaya, 4) Tumbuh persaudaraan sejati!</w:t>
+              <w:t xml:space="preserve">  • Nama Tradisi di Berbagai Daerah: 'Gugur Gunung' (Jawa), 'Mapalus' (Minahasa), 'Pawonda' (Sumba), 'Sikaroban' (Palembang).</w:t>
+              <w:br/>
+            </w:r>
+            <w:r>
+              <w:rPr>
+                <w:rFonts w:ascii="Calibri" w:hAnsi="Calibri"/>
+                <w:color w:val="334155"/>
+                <w:sz w:val="19"/>
+              </w:rPr>
+              <w:t xml:space="preserve">  • Makna Sila ke-3: Mengutamakan kepentingan bersama di atas kepentingan pribadi atau golongan.</w:t>
+              <w:br/>
+            </w:r>
+          </w:p>
+        </w:tc>
+      </w:tr>
+    </w:tbl>
+    <w:p/>
+    <w:tbl>
+      <w:tblPr>
+        <w:tblW w:type="auto" w:w="0"/>
+        <w:jc w:val="center"/>
+        <w:tblLook w:firstColumn="1" w:firstRow="1" w:lastColumn="0" w:lastRow="0" w:noHBand="0" w:noVBand="1" w:val="04A0"/>
+      </w:tblPr>
+      <w:tblGrid>
+        <w:gridCol w:w="9792"/>
+      </w:tblGrid>
+      <w:tr>
+        <w:tc>
+          <w:tcPr>
+            <w:tcW w:type="dxa" w:w="9792"/>
+            <w:shd w:val="clear" w:color="auto" w:fill="FFF1F2"/>
+            <w:tcMar>
+              <w:top w:w="180" w:type="dxa"/>
+              <w:bottom w:w="180" w:type="dxa"/>
+              <w:left w:w="200" w:type="dxa"/>
+              <w:right w:w="200" w:type="dxa"/>
+            </w:tcMar>
+          </w:tcPr>
+          <w:p>
+            <w:pPr>
+              <w:spacing w:line="276" w:lineRule="auto"/>
+            </w:pPr>
+            <w:r>
+              <w:rPr>
+                <w:rFonts w:ascii="Calibri" w:hAnsi="Calibri"/>
+                <w:b/>
+                <w:color w:val="BE123C"/>
+                <w:sz w:val="22"/>
+              </w:rPr>
+              <w:t>SLIDE 5: KESEHARIAN: TRAGEDI BADAI BERINGIN DI JALUR SKATEBOARD</w:t>
+              <w:br/>
+            </w:r>
+            <w:r>
+              <w:rPr>
+                <w:rFonts w:ascii="Calibri" w:hAnsi="Calibri"/>
+                <w:b/>
+                <w:color w:val="B45309"/>
+                <w:sz w:val="19"/>
+              </w:rPr>
+              <w:t>[🏡 KONTEKS NYATA SEHARI-HARI]</w:t>
+              <w:br/>
+            </w:r>
+            <w:r>
+              <w:rPr>
+                <w:rFonts w:ascii="Calibri" w:hAnsi="Calibri"/>
+                <w:i/>
+                <w:color w:val="64748B"/>
+                <w:sz w:val="19"/>
+              </w:rPr>
+              <w:t>🎨 Visual Cue Canva: Ilustrasi pohon beringin tua tumbang melintang menutup gerbang perumahan, lumpur selokan meluap, Pak RT kebingungan sendirian memegang gergaji kecil.</w:t>
+              <w:br/>
+            </w:r>
+            <w:r>
+              <w:rPr>
+                <w:rFonts w:ascii="Calibri" w:hAnsi="Calibri"/>
+                <w:b/>
+                <w:color w:val="1E293B"/>
+                <w:sz w:val="19"/>
+              </w:rPr>
+              <w:t>🎙️ Narasi/Pancingan Guru: "Aqlan bisa saja putar balik dan mencari jalan lain yang bersih. Tapi mengapa Aqlan memilih turun dari papan skate dan mengajak teman-teman membantu Pak RT?"</w:t>
+              <w:br/>
+              <w:br/>
+            </w:r>
+            <w:r>
+              <w:rPr>
+                <w:rFonts w:ascii="Calibri" w:hAnsi="Calibri"/>
+                <w:color w:val="334155"/>
+                <w:sz w:val="19"/>
+              </w:rPr>
+              <w:t xml:space="preserve">  • Peristiwa Nyata Minggu Pagi: Badai semalam merobohkan dahan beringin tua. Jalan komplek tertutup total dan selokan tersumbat sampah.</w:t>
+              <w:br/>
+            </w:r>
+            <w:r>
+              <w:rPr>
+                <w:rFonts w:ascii="Calibri" w:hAnsi="Calibri"/>
+                <w:color w:val="334155"/>
+                <w:sz w:val="19"/>
+              </w:rPr>
+              <w:t xml:space="preserve">  • Dilema Aqlan: Aqlan sudah siap memakai helm dan sepatu untuk latihan skateboard. Kalau jalanan tertutup, Aqlan tidak bisa meluncur.</w:t>
+              <w:br/>
+            </w:r>
+            <w:r>
+              <w:rPr>
+                <w:rFonts w:ascii="Calibri" w:hAnsi="Calibri"/>
+                <w:color w:val="334155"/>
+                <w:sz w:val="19"/>
+              </w:rPr>
+              <w:t xml:space="preserve">  • Pak RT Menghela Napas: 'Kalau Bapak bersihkan sendiri, butuh 5 hari. Nanti malam kalau hujan deras lagi, rumah warga pasti kebanjiran!'</w:t>
+              <w:br/>
+            </w:r>
+            <w:r>
+              <w:rPr>
+                <w:rFonts w:ascii="Calibri" w:hAnsi="Calibri"/>
+                <w:color w:val="334155"/>
+                <w:sz w:val="19"/>
+              </w:rPr>
+              <w:t xml:space="preserve">  • Aksi Ksatria: Aqlan tidak berputar arah dan pulang tidur. Aqlan memanggil Hasyif, Kinanti, dan Samuel untuk bergotong royong membantu Pak RT!</w:t>
               <w:br/>
             </w:r>
           </w:p>
@@ -379,7 +676,17 @@
                 <w:color w:val="BE123C"/>
                 <w:sz w:val="22"/>
               </w:rPr>
-              <w:t>SLIDE 4: KELAS 4: BAHASA INDONESIA JEMBATAN PEMERSATU</w:t>
+              <w:t>SLIDE 6: TEXTBOOK: 4 KEAJAIBAN MANFAAT GOTONG ROYONG</w:t>
+              <w:br/>
+            </w:r>
+            <w:r>
+              <w:rPr>
+                <w:rFonts w:ascii="Calibri" w:hAnsi="Calibri"/>
+                <w:b/>
+                <w:color w:val="4338CA"/>
+                <w:sz w:val="19"/>
+              </w:rPr>
+              <w:t>[📚 KONSEP TEXTBOOK KEMENDIKBUD]</w:t>
               <w:br/>
             </w:r>
             <w:r>
@@ -389,7 +696,7 @@
                 <w:color w:val="64748B"/>
                 <w:sz w:val="19"/>
               </w:rPr>
-              <w:t>🎨 Visual Cue Canva: Peta nusantara dengan ragam bahasa daerah dihubungkan pita emas bertuliskan 'Bahasa Indonesia'.</w:t>
+              <w:t>🎨 Visual Cue Canva: Infografis 4 pilar manfaat gotong royong dengan ikon jam cepat, timbangan ringan, dompet hemat, dan jabat tangan erat.</w:t>
               <w:br/>
             </w:r>
             <w:r>
@@ -399,7 +706,7 @@
                 <w:color w:val="1E293B"/>
                 <w:sz w:val="19"/>
               </w:rPr>
-              <w:t>📖 Story Hook: "Apa jadinya jika saat kerja bakti warga memakai bahasa daerah masing-masing tanpa bahasa persatuan?"</w:t>
+              <w:t>🎙️ Narasi/Pancingan Guru: "Coba bayangkan: satu batang kayu berat 100 kg jika diangkat sendirian tidak akan terangkat. Tapi bagaimana jika diangkat oleh 10 anak sekaligus?"</w:t>
               <w:br/>
               <w:br/>
             </w:r>
@@ -409,7 +716,7 @@
                 <w:color w:val="334155"/>
                 <w:sz w:val="19"/>
               </w:rPr>
-              <w:t xml:space="preserve">  • Keragaman Nusantara: Indonesia memiliki lebih dari 700 bahasa daerah yang berbeda.</w:t>
+              <w:t xml:space="preserve">  • Buku Siswa Kemendikbud Hal 83-88: 4 Manfaat Utama Gotong Royong:</w:t>
               <w:br/>
             </w:r>
             <w:r>
@@ -418,7 +725,7 @@
                 <w:color w:val="334155"/>
                 <w:sz w:val="19"/>
               </w:rPr>
-              <w:t xml:space="preserve">  • Ikrar Sumpah Pemuda 1928: 'Menjunjung bahasa persatuan, Bahasa Indonesia'.</w:t>
+              <w:t xml:space="preserve">  •   1. Pekerjaan Berat Menjadi Ringan: Beban mengangkat kayu besar dibagi ke banyak orang sehingga tidak terasa berat.</w:t>
               <w:br/>
             </w:r>
             <w:r>
@@ -427,7 +734,123 @@
                 <w:color w:val="334155"/>
                 <w:sz w:val="19"/>
               </w:rPr>
-              <w:t xml:space="preserve">  • Fungsi Nyata: Menjadi jembatan komunikasi saat kerja bakti antarwarga yang berbeda suku di perumahan kita.</w:t>
+              <w:t xml:space="preserve">  •   2. Waktu Selesai Menjadi Cepat: Pekerjaan 5 hari Pak RT dapat selesai hanya dalam 45 menit saat dikerjakan bersama puluhan warga.</w:t>
+              <w:br/>
+            </w:r>
+            <w:r>
+              <w:rPr>
+                <w:rFonts w:ascii="Calibri" w:hAnsi="Calibri"/>
+                <w:color w:val="334155"/>
+                <w:sz w:val="19"/>
+              </w:rPr>
+              <w:t xml:space="preserve">  •   3. Menghemat Biaya &amp; Tenaga: Tidak perlu membayar alat berat atau tukang mahal dari luar.</w:t>
+              <w:br/>
+            </w:r>
+            <w:r>
+              <w:rPr>
+                <w:rFonts w:ascii="Calibri" w:hAnsi="Calibri"/>
+                <w:color w:val="334155"/>
+                <w:sz w:val="19"/>
+              </w:rPr>
+              <w:t xml:space="preserve">  •   4. Mempererat Tali Persaudaraan: Menumbuhkan rasa saling peduli, rukun, dan kasih sayang antartetangga.</w:t>
+              <w:br/>
+            </w:r>
+          </w:p>
+        </w:tc>
+      </w:tr>
+    </w:tbl>
+    <w:p/>
+    <w:tbl>
+      <w:tblPr>
+        <w:tblW w:type="auto" w:w="0"/>
+        <w:jc w:val="center"/>
+        <w:tblLook w:firstColumn="1" w:firstRow="1" w:lastColumn="0" w:lastRow="0" w:noHBand="0" w:noVBand="1" w:val="04A0"/>
+      </w:tblPr>
+      <w:tblGrid>
+        <w:gridCol w:w="9792"/>
+      </w:tblGrid>
+      <w:tr>
+        <w:tc>
+          <w:tcPr>
+            <w:tcW w:type="dxa" w:w="9792"/>
+            <w:shd w:val="clear" w:color="auto" w:fill="FFF1F2"/>
+            <w:tcMar>
+              <w:top w:w="180" w:type="dxa"/>
+              <w:bottom w:w="180" w:type="dxa"/>
+              <w:left w:w="200" w:type="dxa"/>
+              <w:right w:w="200" w:type="dxa"/>
+            </w:tcMar>
+          </w:tcPr>
+          <w:p>
+            <w:pPr>
+              <w:spacing w:line="276" w:lineRule="auto"/>
+            </w:pPr>
+            <w:r>
+              <w:rPr>
+                <w:rFonts w:ascii="Calibri" w:hAnsi="Calibri"/>
+                <w:b/>
+                <w:color w:val="BE123C"/>
+                <w:sz w:val="22"/>
+              </w:rPr>
+              <w:t>SLIDE 7: KESEHARIAN: FILOSOFI SEIKAT SAPU LIDI DI HALAMAN KOMPLEK</w:t>
+              <w:br/>
+            </w:r>
+            <w:r>
+              <w:rPr>
+                <w:rFonts w:ascii="Calibri" w:hAnsi="Calibri"/>
+                <w:b/>
+                <w:color w:val="B45309"/>
+                <w:sz w:val="19"/>
+              </w:rPr>
+              <w:t>[🏡 KONTEKS NYATA SEHARI-HARI]</w:t>
+              <w:br/>
+            </w:r>
+            <w:r>
+              <w:rPr>
+                <w:rFonts w:ascii="Calibri" w:hAnsi="Calibri"/>
+                <w:i/>
+                <w:color w:val="64748B"/>
+                <w:sz w:val="19"/>
+              </w:rPr>
+              <w:t>🎨 Visual Cue Canva: Dua gambar kontras berdampingan: Sebatang lidi patah saat menusuk daun (kiri) vs Seikat sapu lidi diikat tali kencang menyapu tumpukan batu dan lumpur bersih seketika (kanan).</w:t>
+              <w:br/>
+            </w:r>
+            <w:r>
+              <w:rPr>
+                <w:rFonts w:ascii="Calibri" w:hAnsi="Calibri"/>
+                <w:b/>
+                <w:color w:val="1E293B"/>
+                <w:sz w:val="19"/>
+              </w:rPr>
+              <w:t>🎙️ Narasi/Pancingan Guru: "Mengapa sapu lidi yang terbuat dari pohon kelapa bisa begitu kuat? Apakah karena batangnya yang hebat, atau karena ikatannya yang kuat?"</w:t>
+              <w:br/>
+              <w:br/>
+            </w:r>
+            <w:r>
+              <w:rPr>
+                <w:rFonts w:ascii="Calibri" w:hAnsi="Calibri"/>
+                <w:color w:val="334155"/>
+                <w:sz w:val="19"/>
+              </w:rPr>
+              <w:t xml:space="preserve">  • Uji Coba Lapangan Basket: Coba ambil satu batang lidi dan sapukan ke lapangan berkerikil -&gt; KREK! Lidi langsung patah terbelah dua.</w:t>
+              <w:br/>
+            </w:r>
+            <w:r>
+              <w:rPr>
+                <w:rFonts w:ascii="Calibri" w:hAnsi="Calibri"/>
+                <w:color w:val="334155"/>
+                <w:sz w:val="19"/>
+              </w:rPr>
+              <w:t xml:space="preserve">  • Kekuatan Mengikat Perbedaan: Saat ratusan batang lidi—ada yang tebal, tipis, panjang, pendek—diikat kencang dalam satu ikatan tali gotong royong, lapangan langsung bersih!</w:t>
+              <w:br/>
+            </w:r>
+            <w:r>
+              <w:rPr>
+                <w:rFonts w:ascii="Calibri" w:hAnsi="Calibri"/>
+                <w:color w:val="334155"/>
+                <w:sz w:val="19"/>
+              </w:rPr>
+              <w:t xml:space="preserve">  • Pesan Luhur untuk Aqlan: 'Sendirian kita rentan patah dan egois. Namun saat bergandengan tangan, kita mampu mengatasi masalah sebesar apa pun!'</w:t>
               <w:br/>
             </w:r>
           </w:p>
@@ -467,7 +890,17 @@
                 <w:color w:val="BE123C"/>
                 <w:sz w:val="22"/>
               </w:rPr>
-              <w:t>SLIDE 5: SLIDE VISUAL SENSORIK ALISYA: KOTAK KEBAIKAN RUKUN</w:t>
+              <w:t>SLIDE 8: TEXTBOOK: BAHASA INDONESIA JEMBATAN PEMERSATU</w:t>
+              <w:br/>
+            </w:r>
+            <w:r>
+              <w:rPr>
+                <w:rFonts w:ascii="Calibri" w:hAnsi="Calibri"/>
+                <w:b/>
+                <w:color w:val="4338CA"/>
+                <w:sz w:val="19"/>
+              </w:rPr>
+              <w:t>[📚 KONSEP TEXTBOOK KEMENDIKBUD]</w:t>
               <w:br/>
             </w:r>
             <w:r>
@@ -477,7 +910,7 @@
                 <w:color w:val="64748B"/>
                 <w:sz w:val="19"/>
               </w:rPr>
-              <w:t>🎨 Visual Cue Canva: 2 Kotak besar sudut membulat kontras. Kiri Hijau Pastel (#ECFDF5), Kanan Merah Muda (#FEF2F2).</w:t>
+              <w:t>🎨 Visual Cue Canva: Gambar teks ikrar Sumpah Pemuda 28 Oktober 1928 dengan latar merah putih dan siluet pemuda-pemudi berbagai suku bersatu.</w:t>
               <w:br/>
             </w:r>
             <w:r>
@@ -487,7 +920,7 @@
                 <w:color w:val="1E293B"/>
                 <w:sz w:val="19"/>
               </w:rPr>
-              <w:t>📖 Story Hook: "Alisya, sentuh kotak hijau yang membuat hati Alisya tersenyum dan kelas menjadi rapi!"</w:t>
+              <w:t>🎙️ Narasi/Pancingan Guru: "Saat kerja bakti di perumahan yang warganya datang dari Sabang sampai Merauke, bahasa apa yang membuat semua orang saling mengerti dan bekerja serempak?"</w:t>
               <w:br/>
               <w:br/>
             </w:r>
@@ -497,7 +930,7 @@
                 <w:color w:val="334155"/>
                 <w:sz w:val="19"/>
               </w:rPr>
-              <w:t xml:space="preserve">  • KOTAK HIJAU (Alisya Senang &amp; Rukun ✅): Gambar anak tersenyum menyapu dan merapikan mainan bersama teman.</w:t>
+              <w:t xml:space="preserve">  • Buku Siswa Kemendikbud Hal 89-94: Sejarah Ikrar Sumpah Pemuda 1928 menegaskan 'Bahasa Indonesia sebagai Bahasa Persatuan'.</w:t>
               <w:br/>
             </w:r>
             <w:r>
@@ -506,7 +939,7 @@
                 <w:color w:val="334155"/>
                 <w:sz w:val="19"/>
               </w:rPr>
-              <w:t xml:space="preserve">  • KOTAK MERAH (Tidak Boleh Ditiru ❌): Gambar anak cemberut merebut mainan teman.</w:t>
+              <w:t xml:space="preserve">  • Fungsi Bahasa Indonesia: Menjadi jembatan komunikasi antarwarga yang memiliki bahasa daerah berbeda.</w:t>
               <w:br/>
             </w:r>
             <w:r>
@@ -515,7 +948,141 @@
                 <w:color w:val="334155"/>
                 <w:sz w:val="19"/>
               </w:rPr>
-              <w:t xml:space="preserve">  • Afirmasi Positif: 'Alisya pintar dan suka bekerja sama dengan teman!'</w:t>
+              <w:t xml:space="preserve">  • Menghindari Salah Paham: Tanpa satu bahasa bersama, warga yang berbicara bahasa Batak, Sunda, dan Jawa akan sulit berkoordinasi saat kerja bakti.</w:t>
+              <w:br/>
+            </w:r>
+            <w:r>
+              <w:rPr>
+                <w:rFonts w:ascii="Calibri" w:hAnsi="Calibri"/>
+                <w:color w:val="334155"/>
+                <w:sz w:val="19"/>
+              </w:rPr>
+              <w:t xml:space="preserve">  • Sikap Berbahasa: Menggunakan Bahasa Indonesia yang baik dan santun dalam pergaulan sehari-hari dengan teman dari berbagai daerah.</w:t>
+              <w:br/>
+            </w:r>
+          </w:p>
+        </w:tc>
+      </w:tr>
+    </w:tbl>
+    <w:p/>
+    <w:tbl>
+      <w:tblPr>
+        <w:tblW w:type="auto" w:w="0"/>
+        <w:jc w:val="center"/>
+        <w:tblLook w:firstColumn="1" w:firstRow="1" w:lastColumn="0" w:lastRow="0" w:noHBand="0" w:noVBand="1" w:val="04A0"/>
+      </w:tblPr>
+      <w:tblGrid>
+        <w:gridCol w:w="9792"/>
+      </w:tblGrid>
+      <w:tr>
+        <w:tc>
+          <w:tcPr>
+            <w:tcW w:type="dxa" w:w="9792"/>
+            <w:shd w:val="clear" w:color="auto" w:fill="FFF1F2"/>
+            <w:tcMar>
+              <w:top w:w="180" w:type="dxa"/>
+              <w:bottom w:w="180" w:type="dxa"/>
+              <w:left w:w="200" w:type="dxa"/>
+              <w:right w:w="200" w:type="dxa"/>
+            </w:tcMar>
+          </w:tcPr>
+          <w:p>
+            <w:pPr>
+              <w:spacing w:line="276" w:lineRule="auto"/>
+            </w:pPr>
+            <w:r>
+              <w:rPr>
+                <w:rFonts w:ascii="Calibri" w:hAnsi="Calibri"/>
+                <w:b/>
+                <w:color w:val="BE123C"/>
+                <w:sz w:val="22"/>
+              </w:rPr>
+              <w:t>SLIDE 9: KESEHARIAN (SENSORI ALISYA): PRAKTIK RUKUN DI RUANG BELAJAR &amp; BERMAIN</w:t>
+              <w:br/>
+            </w:r>
+            <w:r>
+              <w:rPr>
+                <w:rFonts w:ascii="Calibri" w:hAnsi="Calibri"/>
+                <w:b/>
+                <w:color w:val="B45309"/>
+                <w:sz w:val="19"/>
+              </w:rPr>
+              <w:t>[🏡 KONTEKS NYATA SEHARI-HARI]</w:t>
+              <w:br/>
+            </w:r>
+            <w:r>
+              <w:rPr>
+                <w:rFonts w:ascii="Calibri" w:hAnsi="Calibri"/>
+                <w:i/>
+                <w:color w:val="64748B"/>
+                <w:sz w:val="19"/>
+              </w:rPr>
+              <w:t>🎨 Visual Cue Canva: Dua kotak sentuh visual besar dengan warna kontras ramah sensorik. Kotak Hijau (#ECFDF5) dengan border tebal vs Kotak Merah (#FEF2F2).</w:t>
+              <w:br/>
+            </w:r>
+            <w:r>
+              <w:rPr>
+                <w:rFonts w:ascii="Calibri" w:hAnsi="Calibri"/>
+                <w:b/>
+                <w:color w:val="1E293B"/>
+                <w:sz w:val="19"/>
+              </w:rPr>
+              <w:t>🎙️ Narasi/Pancingan Guru: "Alisya, ayo sentuh gambar anak yang suka merapikan mainan bersama teman! Kotak mana yang membuat hati kita senang?"</w:t>
+              <w:br/>
+              <w:br/>
+            </w:r>
+            <w:r>
+              <w:rPr>
+                <w:rFonts w:ascii="Calibri" w:hAnsi="Calibri"/>
+                <w:color w:val="334155"/>
+                <w:sz w:val="19"/>
+              </w:rPr>
+              <w:t xml:space="preserve">  • KOTAK HIJAU (Alisya Senang &amp; Rukun ✅):</w:t>
+              <w:br/>
+            </w:r>
+            <w:r>
+              <w:rPr>
+                <w:rFonts w:ascii="Calibri" w:hAnsi="Calibri"/>
+                <w:color w:val="334155"/>
+                <w:sz w:val="19"/>
+              </w:rPr>
+              <w:t xml:space="preserve">  •   • Gambar anak-anak tersenyum merapikan kotak mainan balok bersama teman.</w:t>
+              <w:br/>
+            </w:r>
+            <w:r>
+              <w:rPr>
+                <w:rFonts w:ascii="Calibri" w:hAnsi="Calibri"/>
+                <w:color w:val="334155"/>
+                <w:sz w:val="19"/>
+              </w:rPr>
+              <w:t xml:space="preserve">  •   • Kalimat Afirmasi: 'Alisya pintar, suka bekerja sama, dan kelas jadi rapi ceria!'</w:t>
+              <w:br/>
+            </w:r>
+            <w:r>
+              <w:rPr>
+                <w:rFonts w:ascii="Calibri" w:hAnsi="Calibri"/>
+                <w:color w:val="334155"/>
+                <w:sz w:val="19"/>
+              </w:rPr>
+              <w:t xml:space="preserve">  • KOTAK MERAH (Tidak Boleh Ditiru ❌):</w:t>
+              <w:br/>
+            </w:r>
+            <w:r>
+              <w:rPr>
+                <w:rFonts w:ascii="Calibri" w:hAnsi="Calibri"/>
+                <w:color w:val="334155"/>
+                <w:sz w:val="19"/>
+              </w:rPr>
+              <w:t xml:space="preserve">  •   • Gambar anak cemberut merebut mainan teman dan berserakan.</w:t>
+              <w:br/>
+            </w:r>
+            <w:r>
+              <w:rPr>
+                <w:rFonts w:ascii="Calibri" w:hAnsi="Calibri"/>
+                <w:color w:val="334155"/>
+                <w:sz w:val="19"/>
+              </w:rPr>
+              <w:t xml:space="preserve">  • Penerapan Konkret: Setelah bermain di rumah atau sekolah, bekerja sama merapikan mainan membuat hati gembira!</w:t>
               <w:br/>
             </w:r>
           </w:p>
@@ -555,7 +1122,17 @@
                 <w:color w:val="BE123C"/>
                 <w:sz w:val="22"/>
               </w:rPr>
-              <w:t>SLIDE 6: KELAS 5: RAHASIA TERMODINAMIKA RUMAH HONAI PAPUA</w:t>
+              <w:t>SLIDE 10: AKSI NYATA &amp; MINI TEST C3: MISI KSATRIA GOTONG ROYONG 2 JAM</w:t>
+              <w:br/>
+            </w:r>
+            <w:r>
+              <w:rPr>
+                <w:rFonts w:ascii="Calibri" w:hAnsi="Calibri"/>
+                <w:b/>
+                <w:color w:val="4338CA"/>
+                <w:sz w:val="19"/>
+              </w:rPr>
+              <w:t>[📚 KONSEP TEXTBOOK KEMENDIKBUD]</w:t>
               <w:br/>
             </w:r>
             <w:r>
@@ -565,7 +1142,7 @@
                 <w:color w:val="64748B"/>
                 <w:sz w:val="19"/>
               </w:rPr>
-              <w:t>🎨 Visual Cue Canva: Foto Rumah Honai Papua silinder melingkar tanpa jendela beratap jerami tebal di tengah kabut pegunungan dingin.</w:t>
+              <w:t>🎨 Visual Cue Canva: Lencana emas bintang ksatria kelas 4, diagram tabel rencana kerja bakti, dan tombol link web game Pendidikan Pancasila.</w:t>
               <w:br/>
             </w:r>
             <w:r>
@@ -575,7 +1152,7 @@
                 <w:color w:val="1E293B"/>
                 <w:sz w:val="19"/>
               </w:rPr>
-              <w:t>📖 Story Hook: "Apakah orang Papua tidak tahu cara membuat jendela? Ataukah mereka justru jauh lebih pintar dari kita dalam menahan hawa dingin?"</w:t>
+              <w:t>🎙️ Narasi/Pancingan Guru: "Aqlan, buktikan kepemimpinan ksatriamu dengan merancang pembagian tugas kerja bakti tercepat dan tuntas!"</w:t>
               <w:br/>
               <w:br/>
             </w:r>
@@ -585,7 +1162,7 @@
                 <w:color w:val="334155"/>
                 <w:sz w:val="19"/>
               </w:rPr>
-              <w:t xml:space="preserve">  • Misteri Honai: Mengapa dibuat bundar rapat dan sengaja tanpa jendela sama sekali?</w:t>
+              <w:t xml:space="preserve">  • Tantangan Kasus Nyata C3 (Aplikasi):</w:t>
               <w:br/>
             </w:r>
             <w:r>
@@ -594,7 +1171,7 @@
                 <w:color w:val="334155"/>
                 <w:sz w:val="19"/>
               </w:rPr>
-              <w:t xml:space="preserve">  • Jawaban Sains Leluhur: Di pegunungan Jayawijaya Papua (suhu malam 5°C), dinding melingkar rapat menahan panas api perapian agar tidak kabur!</w:t>
+              <w:t xml:space="preserve">  •   Saluran air perumahan tersumbat menjelang hujan lebat besok sore. Rancanglah pembagian tugas kerja bakti 2 jam:</w:t>
               <w:br/>
             </w:r>
             <w:r>
@@ -603,7 +1180,161 @@
                 <w:color w:val="334155"/>
                 <w:sz w:val="19"/>
               </w:rPr>
-              <w:t xml:space="preserve">  • Kearifan Lokal: Nenek moyang Papua adalah arsitek termodinamika alami yang sangat jenius!</w:t>
+              <w:t xml:space="preserve">  •   1. Siapa yang membersihkan sampah plastik di selokan?</w:t>
+              <w:br/>
+            </w:r>
+            <w:r>
+              <w:rPr>
+                <w:rFonts w:ascii="Calibri" w:hAnsi="Calibri"/>
+                <w:color w:val="334155"/>
+                <w:sz w:val="19"/>
+              </w:rPr>
+              <w:t xml:space="preserve">  •   2. Siapa yang memotong ranting pohon di jalanan?</w:t>
+              <w:br/>
+            </w:r>
+            <w:r>
+              <w:rPr>
+                <w:rFonts w:ascii="Calibri" w:hAnsi="Calibri"/>
+                <w:color w:val="334155"/>
+                <w:sz w:val="19"/>
+              </w:rPr>
+              <w:t xml:space="preserve">  •   3. Siapa yang menyiapkan air minum dan makanan kecil?</w:t>
+              <w:br/>
+            </w:r>
+            <w:r>
+              <w:rPr>
+                <w:rFonts w:ascii="Calibri" w:hAnsi="Calibri"/>
+                <w:color w:val="334155"/>
+                <w:sz w:val="19"/>
+              </w:rPr>
+              <w:t xml:space="preserve">  • Latihan Interaktif Game: Buka link game Pendidikan Pancasila Bab 3 di https://tiara-dwi.github.io/pkbm-games/pancasila/ (Pilih Nama: Aqlan / Hasyif / Kinanti)!</w:t>
+              <w:br/>
+            </w:r>
+          </w:p>
+        </w:tc>
+      </w:tr>
+    </w:tbl>
+    <w:p/>
+    <w:p>
+      <w:pPr>
+        <w:pStyle w:val="Heading1"/>
+      </w:pPr>
+      <w:r>
+        <w:rPr>
+          <w:color w:val="0D9488"/>
+        </w:rPr>
+        <w:t>DECK 2: KELAS 5 PENDIDIKAN PANCASILA (MISHKA &amp; ARDIANSYAH)</w:t>
+      </w:r>
+    </w:p>
+    <w:tbl>
+      <w:tblPr>
+        <w:tblW w:type="auto" w:w="0"/>
+        <w:jc w:val="center"/>
+        <w:tblLook w:firstColumn="1" w:firstRow="1" w:lastColumn="0" w:lastRow="0" w:noHBand="0" w:noVBand="1" w:val="04A0"/>
+      </w:tblPr>
+      <w:tblGrid>
+        <w:gridCol w:w="9792"/>
+      </w:tblGrid>
+      <w:tr>
+        <w:tc>
+          <w:tcPr>
+            <w:tcW w:type="dxa" w:w="9792"/>
+            <w:shd w:val="clear" w:color="auto" w:fill="F8FAFC"/>
+            <w:tcMar>
+              <w:top w:w="180" w:type="dxa"/>
+              <w:bottom w:w="180" w:type="dxa"/>
+              <w:left w:w="200" w:type="dxa"/>
+              <w:right w:w="200" w:type="dxa"/>
+            </w:tcMar>
+          </w:tcPr>
+          <w:p>
+            <w:pPr>
+              <w:spacing w:line="276" w:lineRule="auto"/>
+            </w:pPr>
+            <w:r>
+              <w:rPr>
+                <w:rFonts w:ascii="Calibri" w:hAnsi="Calibri"/>
+                <w:b/>
+                <w:color w:val="0D9488"/>
+                <w:sz w:val="22"/>
+              </w:rPr>
+              <w:t>SLIDE 1: COVER: PESONA ARSITEKTUR &amp; BUDAYA INDONESIAKU</w:t>
+              <w:br/>
+            </w:r>
+            <w:r>
+              <w:rPr>
+                <w:rFonts w:ascii="Calibri" w:hAnsi="Calibri"/>
+                <w:b/>
+                <w:color w:val="4338CA"/>
+                <w:sz w:val="19"/>
+              </w:rPr>
+              <w:t>[📚 KONSEP TEXTBOOK KEMENDIKBUD]</w:t>
+              <w:br/>
+            </w:r>
+            <w:r>
+              <w:rPr>
+                <w:rFonts w:ascii="Calibri" w:hAnsi="Calibri"/>
+                <w:i/>
+                <w:color w:val="64748B"/>
+                <w:sz w:val="19"/>
+              </w:rPr>
+              <w:t>🎨 Visual Cue Canva: 16:9 Widescreen, palet warna hijau toska tua (#0D9488) dipadu emas dan krem elegan. Ilustrasi Mishka dalam pose senam lantai indah dengan latar megah Rumah Tongkonan dan Rumah Honai.</w:t>
+              <w:br/>
+            </w:r>
+            <w:r>
+              <w:rPr>
+                <w:rFonts w:ascii="Calibri" w:hAnsi="Calibri"/>
+                <w:b/>
+                <w:color w:val="1E293B"/>
+                <w:sz w:val="19"/>
+              </w:rPr>
+              <w:t>🎙️ Narasi/Pancingan Guru: "Halo Mishka dan Ardiansyah! Hari ini kita akan membedah bagaimana nenek moyang kita ratusan tahun lalu adalah arsitek dan ilmuwan alam yang sangat hebat di dunia!"</w:t>
+              <w:br/>
+              <w:br/>
+            </w:r>
+            <w:r>
+              <w:rPr>
+                <w:rFonts w:ascii="Calibri" w:hAnsi="Calibri"/>
+                <w:color w:val="334155"/>
+                <w:sz w:val="19"/>
+              </w:rPr>
+              <w:t xml:space="preserve">  • Judul Slide: KEARIFAN ARSITEKTUR &amp; PESONA BUDAYA INDONESIAKU</w:t>
+              <w:br/>
+            </w:r>
+            <w:r>
+              <w:rPr>
+                <w:rFonts w:ascii="Calibri" w:hAnsi="Calibri"/>
+                <w:color w:val="334155"/>
+                <w:sz w:val="19"/>
+              </w:rPr>
+              <w:t xml:space="preserve">  • Mata Pelajaran: Pendidikan Pancasila Bab 3 (Kelas 5 SD/Fase C)</w:t>
+              <w:br/>
+            </w:r>
+            <w:r>
+              <w:rPr>
+                <w:rFonts w:ascii="Calibri" w:hAnsi="Calibri"/>
+                <w:color w:val="334155"/>
+                <w:sz w:val="19"/>
+              </w:rPr>
+              <w:t xml:space="preserve">  • Tokoh Cerita: Mishka dan Ardiansyah</w:t>
+              <w:br/>
+            </w:r>
+            <w:r>
+              <w:rPr>
+                <w:rFonts w:ascii="Calibri" w:hAnsi="Calibri"/>
+                <w:color w:val="334155"/>
+                <w:sz w:val="19"/>
+              </w:rPr>
+              <w:t xml:space="preserve">  • Fokus Nilai: Keberagaman Budaya, Sains Arsitektur Rumah Adat, dan Harmoni Nusantara</w:t>
+              <w:br/>
+            </w:r>
+            <w:r>
+              <w:rPr>
+                <w:rFonts w:ascii="Calibri" w:hAnsi="Calibri"/>
+                <w:color w:val="334155"/>
+                <w:sz w:val="19"/>
+              </w:rPr>
+              <w:t xml:space="preserve">  • Pengajar: Guru Tiara • PKBM Penerus Bangsa</w:t>
               <w:br/>
             </w:r>
           </w:p>
@@ -640,10 +1371,20 @@
               <w:rPr>
                 <w:rFonts w:ascii="Calibri" w:hAnsi="Calibri"/>
                 <w:b/>
-                <w:color w:val="BE123C"/>
+                <w:color w:val="0D9488"/>
                 <w:sz w:val="22"/>
               </w:rPr>
-              <w:t>SLIDE 7: KELAS 5: HARMONI ARSITEKTUR RUMAH ADAT NUSANTARA</w:t>
+              <w:t>SLIDE 2: TEXTBOOK: FAKTOR GEOGRAFIS PENYEBAB KERAGAMAN BUDAYA</w:t>
+              <w:br/>
+            </w:r>
+            <w:r>
+              <w:rPr>
+                <w:rFonts w:ascii="Calibri" w:hAnsi="Calibri"/>
+                <w:b/>
+                <w:color w:val="4338CA"/>
+                <w:sz w:val="19"/>
+              </w:rPr>
+              <w:t>[📚 KONSEP TEXTBOOK KEMENDIKBUD]</w:t>
               <w:br/>
             </w:r>
             <w:r>
@@ -653,7 +1394,7 @@
                 <w:color w:val="64748B"/>
                 <w:sz w:val="19"/>
               </w:rPr>
-              <w:t>🎨 Visual Cue Canva: Kolase Rumah Tongkonan Toraja (atap perahu bahari), Rumah Gadang Minang (pasak kayu elastis tahan gempa), dan Joglo Jawa.</w:t>
+              <w:t>🎨 Visual Cue Canva: Peta maritim kepulauan nusantara di antara Samudra Hindia dan Samudra Pasifik, dilengkapi angin muson dan rute kapal dagang kuno.</w:t>
               <w:br/>
             </w:r>
             <w:r>
@@ -663,7 +1404,7 @@
                 <w:color w:val="1E293B"/>
                 <w:sz w:val="19"/>
               </w:rPr>
-              <w:t>📖 Story Hook: "Bagaimana memadukan kelenturan lingkaran Honai dan keagungan haluan Tongkonan dalam koreografi senam yang memukau?"</w:t>
+              <w:t>🎙️ Narasi/Pancingan Guru: "Mengapa rumah adat di pegunungan Papua dan rumah adat di pesisir Sulawesi bentuknya sangat berbeda? Apakah karena selera, atau karena hukum alam?"</w:t>
               <w:br/>
               <w:br/>
             </w:r>
@@ -673,7 +1414,7 @@
                 <w:color w:val="334155"/>
                 <w:sz w:val="19"/>
               </w:rPr>
-              <w:t xml:space="preserve">  • Rumah Tongkonan (Toraja): Panggung tinggi mengalirkan sirkulasi udara lembap tropis dan atap busur perahu pelaut.</w:t>
+              <w:t xml:space="preserve">  • Buku Siswa Kemendikbud Hal 73-84: Tiga Faktor Utama Keragaman Budaya Indonesia:</w:t>
               <w:br/>
             </w:r>
             <w:r>
@@ -682,7 +1423,7 @@
                 <w:color w:val="334155"/>
                 <w:sz w:val="19"/>
               </w:rPr>
-              <w:t xml:space="preserve">  • Rumah Gadang (Minangkabau): Sambungan pasak kayu tanpa paku besi membuat bangunan bergoyang elastis saat gempa bumi!</w:t>
+              <w:t xml:space="preserve">  •   1. Letak Strategis Jalur Perdagangan: Terletak di antara dua benua (Asia &amp; Australia) dan dua samudra (Hindia &amp; Pasifik) mengundang pedagang dunia membawa pengaruh budaya.</w:t>
               <w:br/>
             </w:r>
             <w:r>
@@ -691,7 +1432,123 @@
                 <w:color w:val="334155"/>
                 <w:sz w:val="19"/>
               </w:rPr>
-              <w:t xml:space="preserve">  • Kesimpulan Cerdas Mishka: Semua rumah adat lahir dari kejeniusan sains lokal beradaptasi dengan alam pulau masing-masing.</w:t>
+              <w:t xml:space="preserve">  •   2. Kondisi Negara Kepulauan: Lebih dari 17.000 pulau yang terpisah lautan membuat setiap suku mengembangkan adat, rumah, dan bahasa mandiri.</w:t>
+              <w:br/>
+            </w:r>
+            <w:r>
+              <w:rPr>
+                <w:rFonts w:ascii="Calibri" w:hAnsi="Calibri"/>
+                <w:color w:val="334155"/>
+                <w:sz w:val="19"/>
+              </w:rPr>
+              <w:t xml:space="preserve">  •   3. Perbedaan Kondisi Alam: Masyarakat pesisir menjadi pelaut ulung, masyarakat pegunungan menjadi petani tangguh dengan adaptasi arsitektur iklim yang berbeda.</w:t>
+              <w:br/>
+            </w:r>
+          </w:p>
+        </w:tc>
+      </w:tr>
+    </w:tbl>
+    <w:p/>
+    <w:tbl>
+      <w:tblPr>
+        <w:tblW w:type="auto" w:w="0"/>
+        <w:jc w:val="center"/>
+        <w:tblLook w:firstColumn="1" w:firstRow="1" w:lastColumn="0" w:lastRow="0" w:noHBand="0" w:noVBand="1" w:val="04A0"/>
+      </w:tblPr>
+      <w:tblGrid>
+        <w:gridCol w:w="9792"/>
+      </w:tblGrid>
+      <w:tr>
+        <w:tc>
+          <w:tcPr>
+            <w:tcW w:type="dxa" w:w="9792"/>
+            <w:shd w:val="clear" w:color="auto" w:fill="FFF1F2"/>
+            <w:tcMar>
+              <w:top w:w="180" w:type="dxa"/>
+              <w:bottom w:w="180" w:type="dxa"/>
+              <w:left w:w="200" w:type="dxa"/>
+              <w:right w:w="200" w:type="dxa"/>
+            </w:tcMar>
+          </w:tcPr>
+          <w:p>
+            <w:pPr>
+              <w:spacing w:line="276" w:lineRule="auto"/>
+            </w:pPr>
+            <w:r>
+              <w:rPr>
+                <w:rFonts w:ascii="Calibri" w:hAnsi="Calibri"/>
+                <w:b/>
+                <w:color w:val="0D9488"/>
+                <w:sz w:val="22"/>
+              </w:rPr>
+              <w:t>SLIDE 3: KESEHARIAN: DILEMA KOREOGRAFER PENTAS SENI BUDAYA MISHKA</w:t>
+              <w:br/>
+            </w:r>
+            <w:r>
+              <w:rPr>
+                <w:rFonts w:ascii="Calibri" w:hAnsi="Calibri"/>
+                <w:b/>
+                <w:color w:val="B45309"/>
+                <w:sz w:val="19"/>
+              </w:rPr>
+              <w:t>[🏡 KONTEKS NYATA SEHARI-HARI]</w:t>
+              <w:br/>
+            </w:r>
+            <w:r>
+              <w:rPr>
+                <w:rFonts w:ascii="Calibri" w:hAnsi="Calibri"/>
+                <w:i/>
+                <w:color w:val="64748B"/>
+                <w:sz w:val="19"/>
+              </w:rPr>
+              <w:t>🎨 Visual Cue Canva: Ilustrasi Mishka berdiri di tengah studio latihan senam sekolah, dua kelompok temannya berdebat memegang miniatur Rumah Honai vs miniatur Rumah Tongkonan.</w:t>
+              <w:br/>
+            </w:r>
+            <w:r>
+              <w:rPr>
+                <w:rFonts w:ascii="Calibri" w:hAnsi="Calibri"/>
+                <w:b/>
+                <w:color w:val="1E293B"/>
+                <w:sz w:val="19"/>
+              </w:rPr>
+              <w:t>🎙️ Narasi/Pancingan Guru: "Mishka, apa yang kamu rasakan saat teman-teman kelompokmu saling bersikeras dan tidak ada yang mau mengalah? Bagaimana seorang koreografer menemukan titik harmoni?"</w:t>
+              <w:br/>
+              <w:br/>
+            </w:r>
+            <w:r>
+              <w:rPr>
+                <w:rFonts w:ascii="Calibri" w:hAnsi="Calibri"/>
+                <w:color w:val="334155"/>
+                <w:sz w:val="19"/>
+              </w:rPr>
+              <w:t xml:space="preserve">  • Tantangan Festival Budaya Sekolah: Mishka ditunjuk sebagai perancang utama koreografi senam lantai untuk pentas seni bertema Nusantara.</w:t>
+              <w:br/>
+            </w:r>
+            <w:r>
+              <w:rPr>
+                <w:rFonts w:ascii="Calibri" w:hAnsi="Calibri"/>
+                <w:color w:val="334155"/>
+                <w:sz w:val="19"/>
+              </w:rPr>
+              <w:t xml:space="preserve">  • Konflik Antarteman: Kelompok A menuntut panggung bertema Rumah Tongkonan Toraja (Sulsel) karena atap perahunya megah. Kelompok B menuntut tema Rumah Honai Papua (suku Dani) yang unik.</w:t>
+              <w:br/>
+            </w:r>
+            <w:r>
+              <w:rPr>
+                <w:rFonts w:ascii="Calibri" w:hAnsi="Calibri"/>
+                <w:color w:val="334155"/>
+                <w:sz w:val="19"/>
+              </w:rPr>
+              <w:t xml:space="preserve">  • Suasana Memanas: Masing-masing kubu saling meremehkan dan menganggap rumah adat pilihannya yang 'paling keren dan modern'.</w:t>
+              <w:br/>
+            </w:r>
+            <w:r>
+              <w:rPr>
+                <w:rFonts w:ascii="Calibri" w:hAnsi="Calibri"/>
+                <w:color w:val="334155"/>
+                <w:sz w:val="19"/>
+              </w:rPr>
+              <w:t xml:space="preserve">  • Tindakan Bijak Mishka: Mishka tidak memarahi teman-temannya. Mishka mengajak mereka duduk melingkar untuk membedah rahasia sains di balik kedua rumah adat tersebut!</w:t>
               <w:br/>
             </w:r>
           </w:p>
@@ -728,10 +1585,20 @@
               <w:rPr>
                 <w:rFonts w:ascii="Calibri" w:hAnsi="Calibri"/>
                 <w:b/>
-                <w:color w:val="BE123C"/>
+                <w:color w:val="0D9488"/>
                 <w:sz w:val="22"/>
               </w:rPr>
-              <w:t>SLIDE 8: KELAS 6: DILEMA KORIDOR &amp; INTEGRITAS KSATRIA</w:t>
+              <w:t>SLIDE 4: TEXTBOOK: KEJENIUSAN SAINS RUMAH HONAI PAPUA</w:t>
+              <w:br/>
+            </w:r>
+            <w:r>
+              <w:rPr>
+                <w:rFonts w:ascii="Calibri" w:hAnsi="Calibri"/>
+                <w:b/>
+                <w:color w:val="4338CA"/>
+                <w:sz w:val="19"/>
+              </w:rPr>
+              <w:t>[📚 KONSEP TEXTBOOK KEMENDIKBUD]</w:t>
               <w:br/>
             </w:r>
             <w:r>
@@ -741,7 +1608,7 @@
                 <w:color w:val="64748B"/>
                 <w:sz w:val="19"/>
               </w:rPr>
-              <w:t>🎨 Visual Cue Canva: Vas keramik sekolah pecah di lantai marmer koridor sepi tanpa saksi guru, dua anak berdiri di persimpangan pilihan moral.</w:t>
+              <w:t>🎨 Visual Cue Canva: Diagram arsitektur anatomi Rumah Honai: atap kubah jerami alang-alang tebal, dinding silinder kayu papan dua lapis, perapian di tengah ruangan, dan pintu sempit tanpa jendela.</w:t>
               <w:br/>
             </w:r>
             <w:r>
@@ -751,7 +1618,7 @@
                 <w:color w:val="1E293B"/>
                 <w:sz w:val="19"/>
               </w:rPr>
-              <w:t>📖 Story Hook: "Kapan integritasmu benar-benar diuji? Saat kamu tahu kamu bisa lari tanpa ketahuan, tapi hatimu memilih tetap berkata jujur!"</w:t>
+              <w:t>🎙️ Narasi/Pancingan Guru: "Coba perhatikan gambar Rumah Honai ini dengan teliti. Ke mana arah jendelanya? Ternyata memang tidak dibuat jendela! Mengapa nenek moyang suku Dani merancangnya demikian?"</w:t>
               <w:br/>
               <w:br/>
             </w:r>
@@ -761,7 +1628,7 @@
                 <w:color w:val="334155"/>
                 <w:sz w:val="19"/>
               </w:rPr>
-              <w:t xml:space="preserve">  • Peristiwa Nyata: Bola basket mini meleset dan memecahkan vas keramik sekolah di koridor sepi.</w:t>
+              <w:t xml:space="preserve">  • Buku Siswa Kemendikbud Hal 85-94: Rumah Honai suku Dani di Lembah Baliem Pegunungan Jayawijaya Papua.</w:t>
               <w:br/>
             </w:r>
             <w:r>
@@ -770,7 +1637,7 @@
                 <w:color w:val="334155"/>
                 <w:sz w:val="19"/>
               </w:rPr>
-              <w:t xml:space="preserve">  • Ujian Kejujuran: Hendra mengajak lari ke kantin demi aman sesaat. Shan mengajak melapor ke Kepala Sekolah.</w:t>
+              <w:t xml:space="preserve">  • Ciri Fisik Utama: Bentuk dasar silinder bundar, diameter 5-7 meter, beratap jerami melengkung tebal, pintu kecil, dan sama sekali TIDAK MEMILIKI JENDELA.</w:t>
               <w:br/>
             </w:r>
             <w:r>
@@ -779,7 +1646,123 @@
                 <w:color w:val="334155"/>
                 <w:sz w:val="19"/>
               </w:rPr>
-              <w:t xml:space="preserve">  • Hakikat Integritas: Kepatuhan pada norma kesusilaan saat tidak ada orang lain yang melihat!</w:t>
+              <w:t xml:space="preserve">  • Fungsi Ruangan: Terdiri dari dua lantai (lantai bawah tempat berkumpul dan memasak api unggun, lantai atas untuk tempat tidur beralaskan rumput kering).</w:t>
+              <w:br/>
+            </w:r>
+            <w:r>
+              <w:rPr>
+                <w:rFonts w:ascii="Calibri" w:hAnsi="Calibri"/>
+                <w:color w:val="334155"/>
+                <w:sz w:val="19"/>
+              </w:rPr>
+              <w:t xml:space="preserve">  • Bahan Ramah Lingkungan: 100% menggunakan kayu lokal dan jerami alang-alang yang dapat diperbarui dari alam sekitar.</w:t>
+              <w:br/>
+            </w:r>
+          </w:p>
+        </w:tc>
+      </w:tr>
+    </w:tbl>
+    <w:p/>
+    <w:tbl>
+      <w:tblPr>
+        <w:tblW w:type="auto" w:w="0"/>
+        <w:jc w:val="center"/>
+        <w:tblLook w:firstColumn="1" w:firstRow="1" w:lastColumn="0" w:lastRow="0" w:noHBand="0" w:noVBand="1" w:val="04A0"/>
+      </w:tblPr>
+      <w:tblGrid>
+        <w:gridCol w:w="9792"/>
+      </w:tblGrid>
+      <w:tr>
+        <w:tc>
+          <w:tcPr>
+            <w:tcW w:type="dxa" w:w="9792"/>
+            <w:shd w:val="clear" w:color="auto" w:fill="FFF1F2"/>
+            <w:tcMar>
+              <w:top w:w="180" w:type="dxa"/>
+              <w:bottom w:w="180" w:type="dxa"/>
+              <w:left w:w="200" w:type="dxa"/>
+              <w:right w:w="200" w:type="dxa"/>
+            </w:tcMar>
+          </w:tcPr>
+          <w:p>
+            <w:pPr>
+              <w:spacing w:line="276" w:lineRule="auto"/>
+            </w:pPr>
+            <w:r>
+              <w:rPr>
+                <w:rFonts w:ascii="Calibri" w:hAnsi="Calibri"/>
+                <w:b/>
+                <w:color w:val="0D9488"/>
+                <w:sz w:val="22"/>
+              </w:rPr>
+              <w:t>SLIDE 5: KESEHARIAN &amp; SAINS GITA WIRJAWAN: MISTERI HONAI TANPA JENDELA</w:t>
+              <w:br/>
+            </w:r>
+            <w:r>
+              <w:rPr>
+                <w:rFonts w:ascii="Calibri" w:hAnsi="Calibri"/>
+                <w:b/>
+                <w:color w:val="B45309"/>
+                <w:sz w:val="19"/>
+              </w:rPr>
+              <w:t>[🏡 KONTEKS NYATA SEHARI-HARI]</w:t>
+              <w:br/>
+            </w:r>
+            <w:r>
+              <w:rPr>
+                <w:rFonts w:ascii="Calibri" w:hAnsi="Calibri"/>
+                <w:i/>
+                <w:color w:val="64748B"/>
+                <w:sz w:val="19"/>
+              </w:rPr>
+              <w:t>🎨 Visual Cue Canva: Ilustrasi Mishka sedang meneliti buku sains termodinamika bersama Guru Tiara, dengan grafis panah panas melingkar di dalam Rumah Honai saat malam hari yang dingin.</w:t>
+              <w:br/>
+            </w:r>
+            <w:r>
+              <w:rPr>
+                <w:rFonts w:ascii="Calibri" w:hAnsi="Calibri"/>
+                <w:b/>
+                <w:color w:val="1E293B"/>
+                <w:sz w:val="19"/>
+              </w:rPr>
+              <w:t>🎙️ Narasi/Pancingan Guru: "Bayangkan jika Rumah Honai dibuat dengan banyak jendela kaca lebar di pegunungan es. Apa yang akan terjadi pada keluarga yang tidur di dalamnya saat malam badai?"</w:t>
+              <w:br/>
+              <w:br/>
+            </w:r>
+            <w:r>
+              <w:rPr>
+                <w:rFonts w:ascii="Calibri" w:hAnsi="Calibri"/>
+                <w:color w:val="334155"/>
+                <w:sz w:val="19"/>
+              </w:rPr>
+              <w:t xml:space="preserve">  • Pertanyaan Kritis Pak Gita Wirjawan: 'Apakah orang Papua tidak tahu cara membuat jendela? Ataukah mereka justru arsitek termodinamika yang jenius?'</w:t>
+              <w:br/>
+            </w:r>
+            <w:r>
+              <w:rPr>
+                <w:rFonts w:ascii="Calibri" w:hAnsi="Calibri"/>
+                <w:color w:val="334155"/>
+                <w:sz w:val="19"/>
+              </w:rPr>
+              <w:t xml:space="preserve">  • Fakta Sains Suhu Dingin: Di pegunungan Papua, suhu malam hari bisa menembus 5°C sampai di bawah 0°C tanpa ada penghangat listrik modern!</w:t>
+              <w:br/>
+            </w:r>
+            <w:r>
+              <w:rPr>
+                <w:rFonts w:ascii="Calibri" w:hAnsi="Calibri"/>
+                <w:color w:val="334155"/>
+                <w:sz w:val="19"/>
+              </w:rPr>
+              <w:t xml:space="preserve">  • Prinsip Termodinamika Alami: Bentuk bulat aerodinamis menahan terpaan angin badai pegunungan. Dinding rapat tanpa jendela berfungsi sebagai perangkap kalor (heat trap) agar panas perapian tidak kabur ke luar!</w:t>
+              <w:br/>
+            </w:r>
+            <w:r>
+              <w:rPr>
+                <w:rFonts w:ascii="Calibri" w:hAnsi="Calibri"/>
+                <w:color w:val="334155"/>
+                <w:sz w:val="19"/>
+              </w:rPr>
+              <w:t xml:space="preserve">  • Penemuan Mishka: Nenek moyang Papua merancang Honai dengan sains adaptasi iklim tingkat tinggi untuk menyelamatkan nyawa keluarga dari hipotermia!</w:t>
               <w:br/>
             </w:r>
           </w:p>
@@ -816,10 +1799,20 @@
               <w:rPr>
                 <w:rFonts w:ascii="Calibri" w:hAnsi="Calibri"/>
                 <w:b/>
-                <w:color w:val="BE123C"/>
+                <w:color w:val="0D9488"/>
                 <w:sz w:val="22"/>
               </w:rPr>
-              <w:t>SLIDE 9: KELAS 6: KESEIMBANGAN HAK, KEWAJIBAN &amp; KEBERANIAN</w:t>
+              <w:t>SLIDE 6: TEXTBOOK: TONGKONAN TORAJA &amp; RUMAH GADANG TAHAN GEMPA</w:t>
+              <w:br/>
+            </w:r>
+            <w:r>
+              <w:rPr>
+                <w:rFonts w:ascii="Calibri" w:hAnsi="Calibri"/>
+                <w:b/>
+                <w:color w:val="4338CA"/>
+                <w:sz w:val="19"/>
+              </w:rPr>
+              <w:t>[📚 KONSEP TEXTBOOK KEMENDIKBUD]</w:t>
               <w:br/>
             </w:r>
             <w:r>
@@ -829,7 +1822,7 @@
                 <w:color w:val="64748B"/>
                 <w:sz w:val="19"/>
               </w:rPr>
-              <w:t>🎨 Visual Cue Canva: Timbangan neraca keadilan seimbang antara Hak Anak (kasih sayang, pendidikan) dan Kewajiban Anak (disiplin, kejujuran).</w:t>
+              <w:t>🎨 Visual Cue Canva: Foto komparatif Rumah Tongkonan (Toraja) beratap busur perahu di atas tiang panggung kayu uru vs Rumah Gadang (Minangkabau) dengan atap gonjong tanduk kerbau berpasak kayu.</w:t>
               <w:br/>
             </w:r>
             <w:r>
@@ -839,7 +1832,7 @@
                 <w:color w:val="1E293B"/>
                 <w:sz w:val="19"/>
               </w:rPr>
-              <w:t>📖 Story Hook: "Mengapa pengakuan jujur yang berisiko dihukum jauh lebih membanggakan daripada kebohongan manis yang meloloskan kita?"</w:t>
+              <w:t>🎙️ Narasi/Pancingan Guru: "Mengapa Rumah Gadang tidak memakai paku besi semen modern, tetapi justru jauh lebih kokoh bertahan ratusan tahun dari guncangan gempa bumi?"</w:t>
               <w:br/>
               <w:br/>
             </w:r>
@@ -849,7 +1842,7 @@
                 <w:color w:val="334155"/>
                 <w:sz w:val="19"/>
               </w:rPr>
-              <w:t xml:space="preserve">  • Hak Anak: Mendapatkan perlindungan, rasa aman, dan fasilitas belajar yang layak.</w:t>
+              <w:t xml:space="preserve">  • Buku Siswa Kemendikbud Hal 95-104: Kearifan Konstruksi Nusantara:</w:t>
               <w:br/>
             </w:r>
             <w:r>
@@ -858,7 +1851,7 @@
                 <w:color w:val="334155"/>
                 <w:sz w:val="19"/>
               </w:rPr>
-              <w:t xml:space="preserve">  • Kewajiban Anak: Menghormati guru, menaati aturan koridor, dan berani bertanggung jawab.</w:t>
+              <w:t xml:space="preserve">  •   1. Rumah Tongkonan (Toraja, Sulawesi Selatan):</w:t>
               <w:br/>
             </w:r>
             <w:r>
@@ -867,7 +1860,150 @@
                 <w:color w:val="334155"/>
                 <w:sz w:val="19"/>
               </w:rPr>
-              <w:t xml:space="preserve">  • Apresiasi Kepala Sekolah: 'Vas bisa dibeli lagi, tapi kejujuran ksatria tidak ternilai harganya!'</w:t>
+              <w:t xml:space="preserve">  •      • Tiang panggung tinggi melancarkan aliran sirkulasi udara lembap tropis dan menghindari binatang buas.</w:t>
+              <w:br/>
+            </w:r>
+            <w:r>
+              <w:rPr>
+                <w:rFonts w:ascii="Calibri" w:hAnsi="Calibri"/>
+                <w:color w:val="334155"/>
+                <w:sz w:val="19"/>
+              </w:rPr>
+              <w:t xml:space="preserve">  •      • Atap melengkung menyerupai perahu menghadap ke utara melambangkan penghormatan pada leluhur pelaut.</w:t>
+              <w:br/>
+            </w:r>
+            <w:r>
+              <w:rPr>
+                <w:rFonts w:ascii="Calibri" w:hAnsi="Calibri"/>
+                <w:color w:val="334155"/>
+                <w:sz w:val="19"/>
+              </w:rPr>
+              <w:t xml:space="preserve">  •   2. Rumah Gadang (Minangkabau, Sumatera Barat):</w:t>
+              <w:br/>
+            </w:r>
+            <w:r>
+              <w:rPr>
+                <w:rFonts w:ascii="Calibri" w:hAnsi="Calibri"/>
+                <w:color w:val="334155"/>
+                <w:sz w:val="19"/>
+              </w:rPr>
+              <w:t xml:space="preserve">  •      • Dibangun dengan konstruksi pasak kayu elastis tanpa paku besi sama sekali.</w:t>
+              <w:br/>
+            </w:r>
+            <w:r>
+              <w:rPr>
+                <w:rFonts w:ascii="Calibri" w:hAnsi="Calibri"/>
+                <w:color w:val="334155"/>
+                <w:sz w:val="19"/>
+              </w:rPr>
+              <w:t xml:space="preserve">  •      • Sains Tahan Gempa: Saat gempa bumi dahsyat mengguncang Sumatera, sambungan pasak kayu bergoyang elastis meredam getaran sehingga bangunan tidak patah atau runtuh!</w:t>
+              <w:br/>
+            </w:r>
+          </w:p>
+        </w:tc>
+      </w:tr>
+    </w:tbl>
+    <w:p/>
+    <w:tbl>
+      <w:tblPr>
+        <w:tblW w:type="auto" w:w="0"/>
+        <w:jc w:val="center"/>
+        <w:tblLook w:firstColumn="1" w:firstRow="1" w:lastColumn="0" w:lastRow="0" w:noHBand="0" w:noVBand="1" w:val="04A0"/>
+      </w:tblPr>
+      <w:tblGrid>
+        <w:gridCol w:w="9792"/>
+      </w:tblGrid>
+      <w:tr>
+        <w:tc>
+          <w:tcPr>
+            <w:tcW w:type="dxa" w:w="9792"/>
+            <w:shd w:val="clear" w:color="auto" w:fill="FFF1F2"/>
+            <w:tcMar>
+              <w:top w:w="180" w:type="dxa"/>
+              <w:bottom w:w="180" w:type="dxa"/>
+              <w:left w:w="200" w:type="dxa"/>
+              <w:right w:w="200" w:type="dxa"/>
+            </w:tcMar>
+          </w:tcPr>
+          <w:p>
+            <w:pPr>
+              <w:spacing w:line="276" w:lineRule="auto"/>
+            </w:pPr>
+            <w:r>
+              <w:rPr>
+                <w:rFonts w:ascii="Calibri" w:hAnsi="Calibri"/>
+                <w:b/>
+                <w:color w:val="0D9488"/>
+                <w:sz w:val="22"/>
+              </w:rPr>
+              <w:t>SLIDE 7: KESEHARIAN: HARMONI GERAK SENAM DUA RUMAH ADAT</w:t>
+              <w:br/>
+            </w:r>
+            <w:r>
+              <w:rPr>
+                <w:rFonts w:ascii="Calibri" w:hAnsi="Calibri"/>
+                <w:b/>
+                <w:color w:val="B45309"/>
+                <w:sz w:val="19"/>
+              </w:rPr>
+              <w:t>[🏡 KONTEKS NYATA SEHARI-HARI]</w:t>
+              <w:br/>
+            </w:r>
+            <w:r>
+              <w:rPr>
+                <w:rFonts w:ascii="Calibri" w:hAnsi="Calibri"/>
+                <w:i/>
+                <w:color w:val="64748B"/>
+                <w:sz w:val="19"/>
+              </w:rPr>
+              <w:t>🎨 Visual Cue Canva: Ilustrasi formasi senam lantai kelas Mishka: anak-anak membentuk lingkaran rapat hangat (simbol Honai), lalu bergerak mengembang anggun membentuk busur haluan perahu (simbol Tongkonan).</w:t>
+              <w:br/>
+            </w:r>
+            <w:r>
+              <w:rPr>
+                <w:rFonts w:ascii="Calibri" w:hAnsi="Calibri"/>
+                <w:b/>
+                <w:color w:val="1E293B"/>
+                <w:sz w:val="19"/>
+              </w:rPr>
+              <w:t>🎙️ Narasi/Pancingan Guru: "Mishka, bagaimana perasaanmu ketika melihat dua budaya yang sempat dipertengkarkan justru melahirkan gerakan tarian senam yang sangat memukau?"</w:t>
+              <w:br/>
+              <w:br/>
+            </w:r>
+            <w:r>
+              <w:rPr>
+                <w:rFonts w:ascii="Calibri" w:hAnsi="Calibri"/>
+                <w:color w:val="334155"/>
+                <w:sz w:val="19"/>
+              </w:rPr>
+              <w:t xml:space="preserve">  • Solusi Kreatif Koreografer Mishka: Mengapa harus bertengkar memilih salah satu jika kita bisa memadukan keindahan keduanya?</w:t>
+              <w:br/>
+            </w:r>
+            <w:r>
+              <w:rPr>
+                <w:rFonts w:ascii="Calibri" w:hAnsi="Calibri"/>
+                <w:color w:val="334155"/>
+                <w:sz w:val="19"/>
+              </w:rPr>
+              <w:t xml:space="preserve">  • Formasi Babak 1 (Kehangatan Honai): Pesenam membentuk formasi lingkaran berpegangan tangan erat, melambangkan kekompakan dan perlindungan dari hawa dingin.</w:t>
+              <w:br/>
+            </w:r>
+            <w:r>
+              <w:rPr>
+                <w:rFonts w:ascii="Calibri" w:hAnsi="Calibri"/>
+                <w:color w:val="334155"/>
+                <w:sz w:val="19"/>
+              </w:rPr>
+              <w:t xml:space="preserve">  • Formasi Babak 2 (Keagungan Tongkonan): Pesenam melompat anggun dan membentuk sudut busur perahu layar megah, melambangkan keberanian mengarungi samudra luas.</w:t>
+              <w:br/>
+            </w:r>
+            <w:r>
+              <w:rPr>
+                <w:rFonts w:ascii="Calibri" w:hAnsi="Calibri"/>
+                <w:color w:val="334155"/>
+                <w:sz w:val="19"/>
+              </w:rPr>
+              <w:t xml:space="preserve">  • Hasil Pentas Seni: Seluruh penonton dan guru bertepuk tangan kagum! Kedua kubu teman Mishka berpelukan bangga karena budayanya saling melengkapi!</w:t>
               <w:br/>
             </w:r>
           </w:p>
@@ -904,10 +2040,20 @@
               <w:rPr>
                 <w:rFonts w:ascii="Calibri" w:hAnsi="Calibri"/>
                 <w:b/>
-                <w:color w:val="BE123C"/>
+                <w:color w:val="0D9488"/>
                 <w:sz w:val="22"/>
               </w:rPr>
-              <w:t>SLIDE 10: IKRAR KSATRIA PANCASILA PKBM PENERUS BANGSA</w:t>
+              <w:t>SLIDE 8: TEXTBOOK: KERAGAMAN PAKAIAN, SENJATA &amp; ALAT MUSIK TRADISIONAL</w:t>
+              <w:br/>
+            </w:r>
+            <w:r>
+              <w:rPr>
+                <w:rFonts w:ascii="Calibri" w:hAnsi="Calibri"/>
+                <w:b/>
+                <w:color w:val="4338CA"/>
+                <w:sz w:val="19"/>
+              </w:rPr>
+              <w:t>[📚 KONSEP TEXTBOOK KEMENDIKBUD]</w:t>
               <w:br/>
             </w:r>
             <w:r>
@@ -917,7 +2063,7 @@
                 <w:color w:val="64748B"/>
                 <w:sz w:val="19"/>
               </w:rPr>
-              <w:t>🎨 Visual Cue Canva: Lencana bintang emas, peta Indonesia bersinar, anak-anak tersenyum memegang buku dan bendera merah putih.</w:t>
+              <w:t>🎨 Visual Cue Canva: Kolase 4 alat musik daerah: Angklung (Jawa Barat), Sasando (NTT), Gamelan (Jawa/Bali), dan Tifa (Papua/Maluku).</w:t>
               <w:br/>
             </w:r>
             <w:r>
@@ -927,7 +2073,7 @@
                 <w:color w:val="1E293B"/>
                 <w:sz w:val="19"/>
               </w:rPr>
-              <w:t>📖 Story Hook: "Tuliskan satu tindakan gotong royong dan kejujuran yang akan kamu lakukan hari ini!"</w:t>
+              <w:t>🎙️ Narasi/Pancingan Guru: "Tahukah kamu alat musik Sasando terbuat dari daun apa? Mengapa petikan dawainya bisa menghasilkan melodi yang begitu syahdu?"</w:t>
               <w:br/>
               <w:br/>
             </w:r>
@@ -937,7 +2083,7 @@
                 <w:color w:val="334155"/>
                 <w:sz w:val="19"/>
               </w:rPr>
-              <w:t xml:space="preserve">  • 1. Di Lingkungan: Kami aktif bergotong royong dan merawat persatuan.</w:t>
+              <w:t xml:space="preserve">  • Buku Siswa Kemendikbud Hal 105-112: Warisan Mahakarya Takbenda:</w:t>
               <w:br/>
             </w:r>
             <w:r>
@@ -946,7 +2092,7 @@
                 <w:color w:val="334155"/>
                 <w:sz w:val="19"/>
               </w:rPr>
-              <w:t xml:space="preserve">  • 2. Di Tengah Budaya: Kami bangga dan melestarikan kearifan arsitektur nusantara.</w:t>
+              <w:t xml:space="preserve">  •   • Alat Musik Bernada: Angklung dari bambu yang diakui UNESCO, Sasando dari daun lontar pulau Rote, Tifa gendang khas timur.</w:t>
               <w:br/>
             </w:r>
             <w:r>
@@ -955,7 +2101,239 @@
                 <w:color w:val="334155"/>
                 <w:sz w:val="19"/>
               </w:rPr>
-              <w:t xml:space="preserve">  • 3. Di Mana Pun Berada: Kami menjunjung norma kesusilaan dan berani jujur sebagai ksatria sejati!</w:t>
+              <w:t xml:space="preserve">  •   • Pakaian Adat &amp; Kain Tradisional: Batik, Songket, Ulos, dan Tenun Ikat yang memiliki filosofi doa dan martabat luhur.</w:t>
+              <w:br/>
+            </w:r>
+            <w:r>
+              <w:rPr>
+                <w:rFonts w:ascii="Calibri" w:hAnsi="Calibri"/>
+                <w:color w:val="334155"/>
+                <w:sz w:val="19"/>
+              </w:rPr>
+              <w:t xml:space="preserve">  •   • Senjata Tradisional: Keris, Rencong, Mandau, dan Badik sebagai lambang kehormatan dan pertahanan diri ksatria masa lalu.</w:t>
+              <w:br/>
+            </w:r>
+          </w:p>
+        </w:tc>
+      </w:tr>
+    </w:tbl>
+    <w:p/>
+    <w:tbl>
+      <w:tblPr>
+        <w:tblW w:type="auto" w:w="0"/>
+        <w:jc w:val="center"/>
+        <w:tblLook w:firstColumn="1" w:firstRow="1" w:lastColumn="0" w:lastRow="0" w:noHBand="0" w:noVBand="1" w:val="04A0"/>
+      </w:tblPr>
+      <w:tblGrid>
+        <w:gridCol w:w="9792"/>
+      </w:tblGrid>
+      <w:tr>
+        <w:tc>
+          <w:tcPr>
+            <w:tcW w:type="dxa" w:w="9792"/>
+            <w:shd w:val="clear" w:color="auto" w:fill="FFF1F2"/>
+            <w:tcMar>
+              <w:top w:w="180" w:type="dxa"/>
+              <w:bottom w:w="180" w:type="dxa"/>
+              <w:left w:w="200" w:type="dxa"/>
+              <w:right w:w="200" w:type="dxa"/>
+            </w:tcMar>
+          </w:tcPr>
+          <w:p>
+            <w:pPr>
+              <w:spacing w:line="276" w:lineRule="auto"/>
+            </w:pPr>
+            <w:r>
+              <w:rPr>
+                <w:rFonts w:ascii="Calibri" w:hAnsi="Calibri"/>
+                <w:b/>
+                <w:color w:val="0D9488"/>
+                <w:sz w:val="22"/>
+              </w:rPr>
+              <w:t>SLIDE 9: KESEHARIAN: MENGHINDARI ETNOSENTRISME DALAM PERGAULAN</w:t>
+              <w:br/>
+            </w:r>
+            <w:r>
+              <w:rPr>
+                <w:rFonts w:ascii="Calibri" w:hAnsi="Calibri"/>
+                <w:b/>
+                <w:color w:val="B45309"/>
+                <w:sz w:val="19"/>
+              </w:rPr>
+              <w:t>[🏡 KONTEKS NYATA SEHARI-HARI]</w:t>
+              <w:br/>
+            </w:r>
+            <w:r>
+              <w:rPr>
+                <w:rFonts w:ascii="Calibri" w:hAnsi="Calibri"/>
+                <w:i/>
+                <w:color w:val="64748B"/>
+                <w:sz w:val="19"/>
+              </w:rPr>
+              <w:t>🎨 Visual Cue Canva: Ilustrasi Ardiansyah dan teman-temannya saling mencicipi makanan khas daerah saat festival kuliner kelas: papeda Papua, rendang Padang, dan gudeg Jogja.</w:t>
+              <w:br/>
+            </w:r>
+            <w:r>
+              <w:rPr>
+                <w:rFonts w:ascii="Calibri" w:hAnsi="Calibri"/>
+                <w:b/>
+                <w:color w:val="1E293B"/>
+                <w:sz w:val="19"/>
+              </w:rPr>
+              <w:t>🎙️ Narasi/Pancingan Guru: "Ketika ada teman membawa bekal makanan khas daerahnya yang baunya asing bagimu, bagaimana sikap terbaik yang mencerminkan pelajar Pancasila?"</w:t>
+              <w:br/>
+              <w:br/>
+            </w:r>
+            <w:r>
+              <w:rPr>
+                <w:rFonts w:ascii="Calibri" w:hAnsi="Calibri"/>
+                <w:color w:val="334155"/>
+                <w:sz w:val="19"/>
+              </w:rPr>
+              <w:t xml:space="preserve">  • Apa Itu Etnosentrisme? Sikap memandang rendah budaya suku lain dan menganggap budaya daerahnya sendiri yang paling unggul.</w:t>
+              <w:br/>
+            </w:r>
+            <w:r>
+              <w:rPr>
+                <w:rFonts w:ascii="Calibri" w:hAnsi="Calibri"/>
+                <w:color w:val="334155"/>
+                <w:sz w:val="19"/>
+              </w:rPr>
+              <w:t xml:space="preserve">  • Bahaya Etnosentrisme: Menimbulkan perpecahan, saling mengejek di media sosial, dan merusak persatuan bangsa.</w:t>
+              <w:br/>
+            </w:r>
+            <w:r>
+              <w:rPr>
+                <w:rFonts w:ascii="Calibri" w:hAnsi="Calibri"/>
+                <w:color w:val="334155"/>
+                <w:sz w:val="19"/>
+              </w:rPr>
+              <w:t xml:space="preserve">  • Sikap Ksatria Pelajar Kelas 5: Bangga dengan tradisi leluhur sendiri, namun tetap memuji dan mengagumi kehebatan karya teman dari suku lain.</w:t>
+              <w:br/>
+            </w:r>
+            <w:r>
+              <w:rPr>
+                <w:rFonts w:ascii="Calibri" w:hAnsi="Calibri"/>
+                <w:color w:val="334155"/>
+                <w:sz w:val="19"/>
+              </w:rPr>
+              <w:t xml:space="preserve">  • Aksi Sehari-hari: Berani mencoba makanan khas daerah lain, mempelajari tarian nusantara, dan bertutur kata saling menghormati.</w:t>
+              <w:br/>
+            </w:r>
+          </w:p>
+        </w:tc>
+      </w:tr>
+    </w:tbl>
+    <w:p/>
+    <w:tbl>
+      <w:tblPr>
+        <w:tblW w:type="auto" w:w="0"/>
+        <w:jc w:val="center"/>
+        <w:tblLook w:firstColumn="1" w:firstRow="1" w:lastColumn="0" w:lastRow="0" w:noHBand="0" w:noVBand="1" w:val="04A0"/>
+      </w:tblPr>
+      <w:tblGrid>
+        <w:gridCol w:w="9792"/>
+      </w:tblGrid>
+      <w:tr>
+        <w:tc>
+          <w:tcPr>
+            <w:tcW w:type="dxa" w:w="9792"/>
+            <w:shd w:val="clear" w:color="auto" w:fill="F8FAFC"/>
+            <w:tcMar>
+              <w:top w:w="180" w:type="dxa"/>
+              <w:bottom w:w="180" w:type="dxa"/>
+              <w:left w:w="200" w:type="dxa"/>
+              <w:right w:w="200" w:type="dxa"/>
+            </w:tcMar>
+          </w:tcPr>
+          <w:p>
+            <w:pPr>
+              <w:spacing w:line="276" w:lineRule="auto"/>
+            </w:pPr>
+            <w:r>
+              <w:rPr>
+                <w:rFonts w:ascii="Calibri" w:hAnsi="Calibri"/>
+                <w:b/>
+                <w:color w:val="0D9488"/>
+                <w:sz w:val="22"/>
+              </w:rPr>
+              <w:t>SLIDE 10: AKSI NYATA &amp; MINI TEST C4: MAHKAMAH ANALISIS ARSITEKTUR NUSANTARA</w:t>
+              <w:br/>
+            </w:r>
+            <w:r>
+              <w:rPr>
+                <w:rFonts w:ascii="Calibri" w:hAnsi="Calibri"/>
+                <w:b/>
+                <w:color w:val="4338CA"/>
+                <w:sz w:val="19"/>
+              </w:rPr>
+              <w:t>[📚 KONSEP TEXTBOOK KEMENDIKBUD]</w:t>
+              <w:br/>
+            </w:r>
+            <w:r>
+              <w:rPr>
+                <w:rFonts w:ascii="Calibri" w:hAnsi="Calibri"/>
+                <w:i/>
+                <w:color w:val="64748B"/>
+                <w:sz w:val="19"/>
+              </w:rPr>
+              <w:t>🎨 Visual Cue Canva: Lencana emas bintang analitis kelas 5, kartu soal studi kasus C4, dan link game web Pendidikan Pancasila.</w:t>
+              <w:br/>
+            </w:r>
+            <w:r>
+              <w:rPr>
+                <w:rFonts w:ascii="Calibri" w:hAnsi="Calibri"/>
+                <w:b/>
+                <w:color w:val="1E293B"/>
+                <w:sz w:val="19"/>
+              </w:rPr>
+              <w:t>🎙️ Narasi/Pancingan Guru: "Mishka dan Ardiansyah, mari buktikan ketajaman analisismu di game web dan catat skor tertinggimu hari ini!"</w:t>
+              <w:br/>
+              <w:br/>
+            </w:r>
+            <w:r>
+              <w:rPr>
+                <w:rFonts w:ascii="Calibri" w:hAnsi="Calibri"/>
+                <w:color w:val="334155"/>
+                <w:sz w:val="19"/>
+              </w:rPr>
+              <w:t xml:space="preserve">  • Tantangan Kasus Analitis C4:</w:t>
+              <w:br/>
+            </w:r>
+            <w:r>
+              <w:rPr>
+                <w:rFonts w:ascii="Calibri" w:hAnsi="Calibri"/>
+                <w:color w:val="334155"/>
+                <w:sz w:val="19"/>
+              </w:rPr>
+              <w:t xml:space="preserve">  •   1. Analisislah alasan mengapa Rumah Honai Papua sengaja tidak dibuat jendela dan hubungkan dengan suhu dingin pegunungan!</w:t>
+              <w:br/>
+            </w:r>
+            <w:r>
+              <w:rPr>
+                <w:rFonts w:ascii="Calibri" w:hAnsi="Calibri"/>
+                <w:color w:val="334155"/>
+                <w:sz w:val="19"/>
+              </w:rPr>
+              <w:t xml:space="preserve">  •   2. Bandingkan struktur sambungan kayu pasak elastis Rumah Gadang dengan bangunan semen kaku saat menghadapi gempa bumi!</w:t>
+              <w:br/>
+            </w:r>
+            <w:r>
+              <w:rPr>
+                <w:rFonts w:ascii="Calibri" w:hAnsi="Calibri"/>
+                <w:color w:val="334155"/>
+                <w:sz w:val="19"/>
+              </w:rPr>
+              <w:t xml:space="preserve">  •   3. Rancanglah satu ide kegiatan sekolah untuk melestarikan rumah adat nusantara agar tidak punah ditelan zaman!</w:t>
+              <w:br/>
+            </w:r>
+            <w:r>
+              <w:rPr>
+                <w:rFonts w:ascii="Calibri" w:hAnsi="Calibri"/>
+                <w:color w:val="334155"/>
+                <w:sz w:val="19"/>
+              </w:rPr>
+              <w:t xml:space="preserve">  • Latihan Interaktif Game: Buka link game Pendidikan Pancasila Bab 3 di https://tiara-dwi.github.io/pkbm-games/pancasila/ (Pilih Nama: Mishka / Ardiansyah)!</w:t>
               <w:br/>
             </w:r>
           </w:p>
@@ -971,7 +2349,7 @@
         <w:rPr>
           <w:color w:val="B45309"/>
         </w:rPr>
-        <w:t>BAGIAN II: BANK MINI TEST C3 &amp; C4 PENDIDIKAN PANCASILA</w:t>
+        <w:t>BAGIAN II: BANK EVALUASI MINI TEST C3 &amp; C4 PENDIDIKAN PANCASILA</w:t>
       </w:r>
     </w:p>
     <w:p>
@@ -979,7 +2357,7 @@
         <w:pStyle w:val="Heading2"/>
       </w:pPr>
       <w:r>
-        <w:t>📘 1. Mini Test Kelas 4 (Level C3: Penerapan Gotong Royong)</w:t>
+        <w:t>📘 1. Mini Test Kelas 4 (Level C3: Penerapan Gotong Royong Lingkungan)</w:t>
       </w:r>
     </w:p>
     <w:p>
@@ -990,17 +2368,18 @@
         <w:rPr>
           <w:b/>
         </w:rPr>
-        <w:t>Studi Kasus Saluran Air Perumahan Aqlan &amp; Hasyif:</w:t>
+        <w:t>Studi Kasus: Badai Beringin &amp; Saluran Air Perumahan Aqlan</w:t>
         <w:br/>
       </w:r>
       <w:r>
-        <w:t>Menjelang musim penghujan, saluran air utama di perumahan Aqlan tersumbat oleh sampah dan batang pohon tumbang. Jika dikerjakan sendiri oleh petugas kebersihan desa, butuh waktu 5 hari. Padahal badai diprediksi turun besok sore dan dapat membanjiri puluhan rumah warga.</w:t>
+        <w:t>Menjelang musim penghujan, saluran air utama di perumahan Aqlan tersumbat oleh sampah plastik dan dahan beringin tua yang tumbang. Pak RT memperkirakan butuh waktu 5 hari jika hanya dikerjakan oleh petugas kebersihan desa sendirian. Padahal ramalan cuaca BMKG menunjukkan badai hujan deras akan turun besok sore dan berpotensi membanjiri perumahan warga.</w:t>
         <w:br/>
-        <w:t>Tugas C3 Siswa:</w:t>
         <w:br/>
-        <w:t>1. Buatlah rencana pembagian tugas kerja bakti warga (siapa membersihkan sampah, siapa memotong ranting, siapa menyiapkan konsumsi) agar pekerjaan selesai dalam 2 jam!</w:t>
+        <w:t>Pertanyaan C3 (Aplikasi Nyata):</w:t>
         <w:br/>
-        <w:t>2. Jelaskan kaitan antara gotong royong tersebut dengan pengamalan Sila ke-3 Pancasila dan persatuan warga!</w:t>
+        <w:t>1. Rancanglah pembagian tugas kerja bakti warga yang efektif (bagilah kelompok untuk membersihkan selokan, memotong dahan pohon, dan logistik konsumsi) agar pekerjaan selesai tuntas dalam waktu 2 jam saja!</w:t>
+        <w:br/>
+        <w:t>2. Jelaskan kaitan antara tindakan kerja bakti tersebut dengan pengamalan Sila ke-3 Pancasila dan persatuan warga di lingkungan tempat tinggalmu!</w:t>
         <w:br/>
         <w:br/>
       </w:r>
@@ -1021,48 +2400,20 @@
         <w:rPr>
           <w:b/>
         </w:rPr>
-        <w:t>Analisis Arsitektur Rumah Honai vs Rumah Gadang:</w:t>
+        <w:t>Studi Kasus: Sains Adaptasi Iklim Honai Papua vs Rumah Gadang Minangkabau</w:t>
         <w:br/>
       </w:r>
       <w:r>
-        <w:t>Mishka dan Ardiansyah mengamati Rumah Honai (Papua) yang berbentuk silinder melingkar tanpa jendela dari jerami tebal, dan Rumah Gadang (Minangkabau) yang bertiang panggung elastis tanpa paku besi.</w:t>
-        <w:br/>
-        <w:t>Tugas C4 Siswa:</w:t>
-        <w:br/>
-        <w:t>1. Analisislah alasan ilmiah mengapa nenek moyang suku Dani sengaja membuat Rumah Honai bundar tanpa jendela! Hubungkan dengan suhu dingin ekstrem pegunungan Papua!</w:t>
-        <w:br/>
-        <w:t>2. Mengapa struktur sambungan kayu pasak tanpa paku besi pada Rumah Gadang sangat efektif menghadapi bencana gempa bumi di Sumatera? Apa pelajaran sains yang bisa kita petik?</w:t>
+        <w:t>Mishka dan Ardiansyah mengamati Rumah Honai (suku Dani di Pegunungan Jayawijaya Papua) yang berbentuk silinder melingkar tanpa jendela beralaskan jerami tebal, serta Rumah Gadang (Minangkabau di Sumatera Barat) yang bertiang panggung gonjong dengan sambungan pasak kayu elastis tanpa paku besi.</w:t>
         <w:br/>
         <w:br/>
-      </w:r>
-    </w:p>
-    <w:p>
-      <w:pPr>
-        <w:pStyle w:val="Heading2"/>
-      </w:pPr>
-      <w:r>
-        <w:t>📕 3. Mini Test Kelas 6 (Level C4: Evaluasi Dilema Integritas Moral)</w:t>
-      </w:r>
-    </w:p>
-    <w:p>
-      <w:pPr>
-        <w:spacing w:line="276" w:lineRule="auto"/>
-      </w:pPr>
-      <w:r>
-        <w:rPr>
-          <w:b/>
-        </w:rPr>
-        <w:t>Dilema Vas Keramik Pecah di Koridor Sepi:</w:t>
+        <w:t>Pertanyaan C4 (Analisis Kritis):</w:t>
         <w:br/>
-      </w:r>
-      <w:r>
-        <w:t>Shan dan Hendra tidak sengaja memecahkan vas keramik sekolah saat bermain bola di koridor. Tidak ada saksi atau CCTV. Hendra mengajak Shan segera lari dan berbohong agar tidak dimarahi.</w:t>
+        <w:t>1. Analisislah alasan ilmiah mengapa nenek moyang suku Dani sengaja TIDAK membuat jendela pada Rumah Honai! Hubungkan analisis ini dengan prinsip termodinamika suhu dingin ekstrem pegunungan Papua!</w:t>
         <w:br/>
-        <w:t>Tugas C4 Siswa:</w:t>
+        <w:t>2. Mengapa sistem sambungan kayu pasak elastis tanpa paku pada Rumah Gadang Minangkabau jauh lebih unggul menghadapi bencana gempa bumi dibanding bangunan tembok semen kaku? Apa bukti kearifan lokal yang bisa kita pelajari?</w:t>
         <w:br/>
-        <w:t>1. Evaluasilah dampak jangka panjang terhadap karakter moral seorang siswa jika ia memilih berbohong dan melarikan diri dari kesalahannya!</w:t>
-        <w:br/>
-        <w:t>2. Bandingkanlah antara 'rasa takut dihukum' dengan 'keberanian moral ksatria untuk jujur'. Mengapa mengakui kesalahan secara terbuka merupakan wujud ketaatan norma kesusilaan tertinggi?</w:t>
+        <w:t>3. Rancanglah satu usulan kreatif bagaimana generasi muda dapat melestarikan dan mempromosikan kejeniusan arsitektur rumah adat nusantara di media sosial!</w:t>
         <w:br/>
         <w:br/>
       </w:r>
@@ -1201,7 +2552,7 @@
                 <w:rFonts w:ascii="Calibri" w:hAnsi="Calibri"/>
                 <w:sz w:val="19"/>
               </w:rPr>
-              <w:t>Membedah akar dilema gotong royong, sains termodinamika arsitektur adat, dan norma kesusilaan secara kritis.</w:t>
+              <w:t>Mampu membedah akar sains adaptasi termodinamika Honai dan elastisitas gempa Gadang secara logis dan ilmiah.</w:t>
             </w:r>
           </w:p>
         </w:tc>
@@ -1246,7 +2597,7 @@
                 <w:b/>
                 <w:sz w:val="19"/>
               </w:rPr>
-              <w:t>Aplikasi Solusi Nyata (C3)</w:t>
+              <w:t>Aplikasi Solusi Gotong Royong (C3)</w:t>
             </w:r>
           </w:p>
         </w:tc>
@@ -1267,7 +2618,7 @@
                 <w:rFonts w:ascii="Calibri" w:hAnsi="Calibri"/>
                 <w:sz w:val="19"/>
               </w:rPr>
-              <w:t>Merancang pembagian tugas kerja bakti dan langkah pertanggungjawaban ksatria secara runtut dan realistis.</w:t>
+              <w:t>Merancang pembagian tugas kerja bakti 2 jam secara runtut, realistis, dan efektif.</w:t>
             </w:r>
           </w:p>
         </w:tc>
@@ -1312,7 +2663,7 @@
                 <w:b/>
                 <w:sz w:val="19"/>
               </w:rPr>
-              <w:t>Koneksi Nilai Sila Pancasila</w:t>
+              <w:t>Integrasi Nilai Sila Pancasila</w:t>
             </w:r>
           </w:p>
         </w:tc>
@@ -1333,7 +2684,7 @@
                 <w:rFonts w:ascii="Calibri" w:hAnsi="Calibri"/>
                 <w:sz w:val="19"/>
               </w:rPr>
-              <w:t>Menghubungkan kasus dengan Sila ke-3, norma hukum, dan keberagaman budaya bangsa secara presisi.</w:t>
+              <w:t>Menghubungkan kasus dengan Sila ke-3 (Persatuan Indonesia) dan sikap anti-etnosentrisme secara tepat.</w:t>
             </w:r>
           </w:p>
         </w:tc>
@@ -1378,7 +2729,7 @@
                 <w:b/>
                 <w:sz w:val="19"/>
               </w:rPr>
-              <w:t>Bahasa &amp; Sikap Ksatria</w:t>
+              <w:t>Kerapian Bahasa &amp; Argumen Santun</w:t>
             </w:r>
           </w:p>
         </w:tc>
@@ -1399,7 +2750,7 @@
                 <w:rFonts w:ascii="Calibri" w:hAnsi="Calibri"/>
                 <w:sz w:val="19"/>
               </w:rPr>
-              <w:t>Menyampaikan pemikiran dengan Bahasa Indonesia yang santun, logis, dan mencerminkan integritas tinggi.</w:t>
+              <w:t>Mengemukakan gagasan dengan Bahasa Indonesia yang terstruktur, santun, dan mencerminkan karakter ksatria.</w:t>
             </w:r>
           </w:p>
         </w:tc>

</xml_diff>